<commit_message>
Convert sidebar menu to tab-based navigation
</commit_message>
<xml_diff>
--- a/내가 만들고 싶은.docx
+++ b/내가 만들고 싶은.docx
@@ -36,51 +36,65 @@
           <w:numId w:val="1"/>
         </w:numPr>
         <w:ind w:leftChars="0"/>
-      </w:pPr>
-      <w:r>
-        <w:rPr>
-          <w:rFonts w:hint="eastAsia"/>
+        <w:rPr>
+          <w:highlight w:val="yellow"/>
+        </w:rPr>
+      </w:pPr>
+      <w:r>
+        <w:rPr>
+          <w:rFonts w:hint="eastAsia"/>
+          <w:highlight w:val="yellow"/>
         </w:rPr>
         <w:t xml:space="preserve">최근 </w:t>
       </w:r>
       <w:r>
+        <w:rPr>
+          <w:highlight w:val="yellow"/>
+        </w:rPr>
         <w:t>1</w:t>
       </w:r>
       <w:r>
         <w:rPr>
           <w:rFonts w:hint="eastAsia"/>
+          <w:highlight w:val="yellow"/>
         </w:rPr>
         <w:t>달간 주식 시장에서 자금이 쏠리고 있는 업종(예를 들어 반도체,</w:t>
       </w:r>
       <w:r>
+        <w:rPr>
+          <w:highlight w:val="yellow"/>
+        </w:rPr>
         <w:t xml:space="preserve"> </w:t>
       </w:r>
       <w:r>
         <w:rPr>
           <w:rFonts w:hint="eastAsia"/>
-        </w:rPr>
-        <w:t>전</w:t>
-      </w:r>
-      <w:bookmarkStart w:id="0" w:name="_GoBack"/>
-      <w:bookmarkEnd w:id="0"/>
-      <w:r>
-        <w:rPr>
-          <w:rFonts w:hint="eastAsia"/>
-        </w:rPr>
-        <w:t>력기기 등)</w:t>
-      </w:r>
-      <w:r>
+          <w:highlight w:val="yellow"/>
+        </w:rPr>
+        <w:t>전력기기 등)</w:t>
+      </w:r>
+      <w:r>
+        <w:rPr>
+          <w:highlight w:val="yellow"/>
+        </w:rPr>
         <w:t xml:space="preserve"> </w:t>
       </w:r>
       <w:r>
+        <w:rPr>
+          <w:highlight w:val="yellow"/>
+        </w:rPr>
         <w:t>5</w:t>
       </w:r>
       <w:r>
+        <w:rPr>
+          <w:highlight w:val="yellow"/>
+        </w:rPr>
         <w:t xml:space="preserve">가지 </w:t>
       </w:r>
       <w:r>
         <w:rPr>
           <w:rFonts w:hint="eastAsia"/>
+          <w:highlight w:val="yellow"/>
         </w:rPr>
         <w:t>list up</w:t>
       </w:r>
@@ -209,50 +223,68 @@
           <w:numId w:val="1"/>
         </w:numPr>
         <w:ind w:leftChars="0"/>
-      </w:pPr>
-      <w:r>
-        <w:rPr>
-          <w:rFonts w:hint="eastAsia"/>
+        <w:rPr>
+          <w:highlight w:val="yellow"/>
+        </w:rPr>
+      </w:pPr>
+      <w:r>
+        <w:rPr>
+          <w:rFonts w:hint="eastAsia"/>
+          <w:highlight w:val="yellow"/>
         </w:rPr>
         <w:t>경제신문(매일경제,</w:t>
       </w:r>
       <w:r>
+        <w:rPr>
+          <w:highlight w:val="yellow"/>
+        </w:rPr>
         <w:t xml:space="preserve"> </w:t>
       </w:r>
       <w:r>
         <w:rPr>
           <w:rFonts w:hint="eastAsia"/>
+          <w:highlight w:val="yellow"/>
         </w:rPr>
         <w:t>한국경제신문)의 금융,</w:t>
       </w:r>
       <w:r>
+        <w:rPr>
+          <w:highlight w:val="yellow"/>
+        </w:rPr>
         <w:t xml:space="preserve"> business, </w:t>
       </w:r>
       <w:r>
         <w:rPr>
           <w:rFonts w:hint="eastAsia"/>
+          <w:highlight w:val="yellow"/>
         </w:rPr>
         <w:t>증권</w:t>
       </w:r>
       <w:r>
         <w:rPr>
           <w:rFonts w:hint="eastAsia"/>
+          <w:highlight w:val="yellow"/>
         </w:rPr>
         <w:t>/</w:t>
       </w:r>
       <w:r>
         <w:rPr>
           <w:rFonts w:hint="eastAsia"/>
+          <w:highlight w:val="yellow"/>
         </w:rPr>
         <w:t>시황,</w:t>
       </w:r>
       <w:r>
+        <w:rPr>
+          <w:highlight w:val="yellow"/>
+        </w:rPr>
         <w:t xml:space="preserve"> </w:t>
       </w:r>
       <w:proofErr w:type="spellStart"/>
       <w:r>
         <w:rPr>
           <w:rFonts w:hint="eastAsia"/>
+          <w:highlight w:val="yellow"/>
         </w:rPr>
         <w:t>기업뉴스</w:t>
       </w:r>
@@ -260,6 +292,7 @@
       <w:r>
         <w:rPr>
           <w:rFonts w:hint="eastAsia"/>
+          <w:highlight w:val="yellow"/>
         </w:rPr>
         <w:t xml:space="preserve"> 등을 검색하여 개별기업의 </w:t>
       </w:r>
@@ -267,6 +300,7 @@
       <w:r>
         <w:rPr>
           <w:rFonts w:hint="eastAsia"/>
+          <w:highlight w:val="yellow"/>
         </w:rPr>
         <w:t>주요이슈에</w:t>
       </w:r>
@@ -274,6 +308,7 @@
       <w:r>
         <w:rPr>
           <w:rFonts w:hint="eastAsia"/>
+          <w:highlight w:val="yellow"/>
         </w:rPr>
         <w:t xml:space="preserve"> 대해 헤드라인 뉴스만 제공</w:t>
       </w:r>
@@ -286,64 +321,92 @@
           <w:numId w:val="1"/>
         </w:numPr>
         <w:ind w:leftChars="0"/>
-      </w:pPr>
-      <w:r>
-        <w:rPr>
-          <w:rFonts w:hint="eastAsia"/>
+        <w:rPr>
+          <w:highlight w:val="yellow"/>
+        </w:rPr>
+      </w:pPr>
+      <w:r>
+        <w:rPr>
+          <w:rFonts w:hint="eastAsia"/>
+          <w:highlight w:val="yellow"/>
         </w:rPr>
         <w:t xml:space="preserve">신호분석법을 통해 </w:t>
       </w:r>
       <w:r>
+        <w:rPr>
+          <w:highlight w:val="yellow"/>
+        </w:rPr>
         <w:t>MACD “</w:t>
       </w:r>
       <w:r>
         <w:rPr>
           <w:rFonts w:hint="eastAsia"/>
+          <w:highlight w:val="yellow"/>
         </w:rPr>
         <w:t>매수</w:t>
       </w:r>
       <w:r>
+        <w:rPr>
+          <w:highlight w:val="yellow"/>
+        </w:rPr>
         <w:t>”</w:t>
       </w:r>
       <w:r>
         <w:rPr>
           <w:rFonts w:hint="eastAsia"/>
+          <w:highlight w:val="yellow"/>
         </w:rPr>
         <w:t xml:space="preserve">이고 </w:t>
       </w:r>
       <w:r>
+        <w:rPr>
+          <w:highlight w:val="yellow"/>
+        </w:rPr>
         <w:t xml:space="preserve">RSI </w:t>
       </w:r>
       <w:r>
         <w:rPr>
           <w:rFonts w:hint="eastAsia"/>
+          <w:highlight w:val="yellow"/>
         </w:rPr>
         <w:t xml:space="preserve">가 </w:t>
       </w:r>
       <w:r>
+        <w:rPr>
+          <w:highlight w:val="yellow"/>
+        </w:rPr>
         <w:t>40</w:t>
       </w:r>
       <w:r>
         <w:rPr>
           <w:rFonts w:hint="eastAsia"/>
+          <w:highlight w:val="yellow"/>
         </w:rPr>
         <w:t>이하이며,</w:t>
       </w:r>
       <w:r>
+        <w:rPr>
+          <w:highlight w:val="yellow"/>
+        </w:rPr>
         <w:t xml:space="preserve"> 20</w:t>
       </w:r>
       <w:r>
         <w:rPr>
           <w:rFonts w:hint="eastAsia"/>
+          <w:highlight w:val="yellow"/>
         </w:rPr>
         <w:t xml:space="preserve">일선과 </w:t>
       </w:r>
       <w:r>
+        <w:rPr>
+          <w:highlight w:val="yellow"/>
+        </w:rPr>
         <w:t>60</w:t>
       </w:r>
       <w:r>
         <w:rPr>
           <w:rFonts w:hint="eastAsia"/>
+          <w:highlight w:val="yellow"/>
         </w:rPr>
         <w:t xml:space="preserve">일선이 </w:t>
       </w:r>
@@ -351,6 +414,7 @@
       <w:r>
         <w:rPr>
           <w:rFonts w:hint="eastAsia"/>
+          <w:highlight w:val="yellow"/>
         </w:rPr>
         <w:t>정배열이</w:t>
       </w:r>
@@ -358,24 +422,33 @@
       <w:r>
         <w:rPr>
           <w:rFonts w:hint="eastAsia"/>
+          <w:highlight w:val="yellow"/>
         </w:rPr>
         <w:t xml:space="preserve"> 종목을 </w:t>
       </w:r>
       <w:r>
+        <w:rPr>
+          <w:highlight w:val="yellow"/>
+        </w:rPr>
         <w:t>20</w:t>
       </w:r>
       <w:r>
         <w:rPr>
           <w:rFonts w:hint="eastAsia"/>
+          <w:highlight w:val="yellow"/>
         </w:rPr>
         <w:t xml:space="preserve">개만 </w:t>
       </w:r>
       <w:r>
+        <w:rPr>
+          <w:highlight w:val="yellow"/>
+        </w:rPr>
         <w:t>list up(</w:t>
       </w:r>
       <w:r>
         <w:rPr>
           <w:rFonts w:hint="eastAsia"/>
+          <w:highlight w:val="yellow"/>
         </w:rPr>
         <w:t>네이버 증권 사이트 활용)</w:t>
       </w:r>
@@ -394,73 +467,52 @@
       </w:pPr>
       <w:r>
         <w:rPr>
-          <w:highlight w:val="yellow"/>
-        </w:rPr>
-        <w:t>“</w:t>
-      </w:r>
-      <w:proofErr w:type="spellStart"/>
-      <w:r>
-        <w:rPr>
-          <w:rFonts w:hint="eastAsia"/>
-          <w:highlight w:val="yellow"/>
-        </w:rPr>
-        <w:t>시장자금</w:t>
-      </w:r>
-      <w:proofErr w:type="spellEnd"/>
-      <w:r>
-        <w:rPr>
-          <w:rFonts w:hint="eastAsia"/>
-          <w:highlight w:val="yellow"/>
-        </w:rPr>
-        <w:t xml:space="preserve"> 및 </w:t>
-      </w:r>
-      <w:proofErr w:type="spellStart"/>
-      <w:r>
-        <w:rPr>
-          <w:rFonts w:hint="eastAsia"/>
-          <w:highlight w:val="yellow"/>
-        </w:rPr>
-        <w:t>업종분석</w:t>
-      </w:r>
-      <w:proofErr w:type="spellEnd"/>
-      <w:r>
-        <w:rPr>
-          <w:highlight w:val="yellow"/>
-        </w:rPr>
-        <w:t xml:space="preserve">” part </w:t>
-      </w:r>
-      <w:r>
-        <w:rPr>
-          <w:rFonts w:hint="eastAsia"/>
-          <w:highlight w:val="yellow"/>
-        </w:rPr>
-        <w:t xml:space="preserve">에 별도의 탭으로 </w:t>
-      </w:r>
-      <w:r>
-        <w:rPr>
-          <w:rFonts w:hint="eastAsia"/>
-          <w:highlight w:val="yellow"/>
-        </w:rPr>
-        <w:t xml:space="preserve">외국인이 </w:t>
-      </w:r>
-      <w:r>
-        <w:rPr>
-          <w:highlight w:val="yellow"/>
-        </w:rPr>
-        <w:t>7</w:t>
-      </w:r>
-      <w:r>
-        <w:rPr>
-          <w:rFonts w:hint="eastAsia"/>
-          <w:highlight w:val="yellow"/>
-        </w:rPr>
-        <w:t xml:space="preserve">일간 연속 매수한 코스피와 코스닥 종목 10개만 </w:t>
+          <w:rFonts w:hint="eastAsia"/>
+          <w:highlight w:val="yellow"/>
+        </w:rPr>
+        <w:t xml:space="preserve">2026년도 증권사 최우수 애널리스트로 선정된 </w:t>
+      </w:r>
+      <w:proofErr w:type="spellStart"/>
+      <w:r>
+        <w:rPr>
+          <w:rFonts w:hint="eastAsia"/>
+          <w:highlight w:val="yellow"/>
+        </w:rPr>
+        <w:t>애널리스트</w:t>
+      </w:r>
+      <w:proofErr w:type="spellEnd"/>
+      <w:r>
+        <w:rPr>
+          <w:rFonts w:hint="eastAsia"/>
+          <w:highlight w:val="yellow"/>
+        </w:rPr>
+        <w:t xml:space="preserve"> 5명이 최근 </w:t>
+      </w:r>
+      <w:r>
+        <w:rPr>
+          <w:highlight w:val="yellow"/>
+        </w:rPr>
+        <w:t>1</w:t>
+      </w:r>
+      <w:r>
+        <w:rPr>
+          <w:rFonts w:hint="eastAsia"/>
+          <w:highlight w:val="yellow"/>
+        </w:rPr>
+        <w:t xml:space="preserve">주일간 추천한 종목을 </w:t>
       </w:r>
       <w:r>
         <w:rPr>
           <w:highlight w:val="yellow"/>
         </w:rPr>
         <w:t>list up</w:t>
+      </w:r>
+      <w:r>
+        <w:rPr>
+          <w:rFonts w:hint="eastAsia"/>
+          <w:highlight w:val="yellow"/>
+        </w:rPr>
+        <w:t xml:space="preserve"> </w:t>
       </w:r>
     </w:p>
     <w:p>
@@ -480,49 +532,182 @@
           <w:rFonts w:hint="eastAsia"/>
           <w:highlight w:val="yellow"/>
         </w:rPr>
-        <w:t xml:space="preserve">2026년도 증권사 최우수 애널리스트로 선정된 </w:t>
-      </w:r>
-      <w:proofErr w:type="spellStart"/>
-      <w:r>
-        <w:rPr>
-          <w:rFonts w:hint="eastAsia"/>
-          <w:highlight w:val="yellow"/>
-        </w:rPr>
-        <w:t>애널리스트</w:t>
-      </w:r>
-      <w:proofErr w:type="spellEnd"/>
-      <w:r>
-        <w:rPr>
-          <w:rFonts w:hint="eastAsia"/>
-          <w:highlight w:val="yellow"/>
-        </w:rPr>
-        <w:t xml:space="preserve"> 5명이 최근 </w:t>
-      </w:r>
-      <w:r>
-        <w:rPr>
-          <w:highlight w:val="yellow"/>
-        </w:rPr>
-        <w:t>1</w:t>
-      </w:r>
-      <w:r>
-        <w:rPr>
-          <w:rFonts w:hint="eastAsia"/>
-          <w:highlight w:val="yellow"/>
-        </w:rPr>
-        <w:t xml:space="preserve">주일간 추천한 종목을 </w:t>
-      </w:r>
-      <w:r>
-        <w:rPr>
-          <w:highlight w:val="yellow"/>
-        </w:rPr>
-        <w:t>list up</w:t>
-      </w:r>
-      <w:r>
-        <w:rPr>
-          <w:rFonts w:hint="eastAsia"/>
+        <w:t xml:space="preserve">메뉴에 추가하여 </w:t>
+      </w:r>
+      <w:r>
+        <w:rPr>
+          <w:highlight w:val="yellow"/>
+        </w:rPr>
+        <w:t>“</w:t>
+      </w:r>
+      <w:r>
+        <w:rPr>
+          <w:rFonts w:hint="eastAsia"/>
+          <w:highlight w:val="yellow"/>
+        </w:rPr>
+        <w:t>가치재평가주</w:t>
+      </w:r>
+      <w:r>
+        <w:rPr>
+          <w:highlight w:val="yellow"/>
+        </w:rPr>
+        <w:t>”</w:t>
+      </w:r>
+      <w:proofErr w:type="spellStart"/>
+      <w:r>
+        <w:rPr>
+          <w:highlight w:val="yellow"/>
+        </w:rPr>
+        <w:t>를</w:t>
+      </w:r>
+      <w:proofErr w:type="spellEnd"/>
+      <w:r>
+        <w:rPr>
           <w:highlight w:val="yellow"/>
         </w:rPr>
         <w:t xml:space="preserve"> </w:t>
+      </w:r>
+      <w:r>
+        <w:rPr>
+          <w:rFonts w:hint="eastAsia"/>
+          <w:highlight w:val="yellow"/>
+        </w:rPr>
+        <w:t xml:space="preserve">만들고 저 </w:t>
+      </w:r>
+      <w:r>
+        <w:rPr>
+          <w:highlight w:val="yellow"/>
+        </w:rPr>
+        <w:t xml:space="preserve">PBR </w:t>
+      </w:r>
+      <w:r>
+        <w:rPr>
+          <w:rFonts w:hint="eastAsia"/>
+          <w:highlight w:val="yellow"/>
+        </w:rPr>
+        <w:t xml:space="preserve">종목(상위 </w:t>
+      </w:r>
+      <w:r>
+        <w:rPr>
+          <w:highlight w:val="yellow"/>
+        </w:rPr>
+        <w:t>10</w:t>
+      </w:r>
+      <w:r>
+        <w:rPr>
+          <w:rFonts w:hint="eastAsia"/>
+          <w:highlight w:val="yellow"/>
+        </w:rPr>
+        <w:t>개)</w:t>
+      </w:r>
+      <w:r>
+        <w:rPr>
+          <w:highlight w:val="yellow"/>
+        </w:rPr>
+        <w:t xml:space="preserve">, </w:t>
+      </w:r>
+      <w:proofErr w:type="spellStart"/>
+      <w:r>
+        <w:rPr>
+          <w:rFonts w:hint="eastAsia"/>
+          <w:highlight w:val="yellow"/>
+        </w:rPr>
+        <w:t>매출이익</w:t>
+      </w:r>
+      <w:proofErr w:type="spellEnd"/>
+      <w:r>
+        <w:rPr>
+          <w:rFonts w:hint="eastAsia"/>
+          <w:highlight w:val="yellow"/>
+        </w:rPr>
+        <w:t xml:space="preserve"> </w:t>
+      </w:r>
+      <w:r>
+        <w:rPr>
+          <w:highlight w:val="yellow"/>
+        </w:rPr>
+        <w:t>40%</w:t>
+      </w:r>
+      <w:r>
+        <w:rPr>
+          <w:rFonts w:hint="eastAsia"/>
+          <w:highlight w:val="yellow"/>
+        </w:rPr>
+        <w:t xml:space="preserve">이상인 종목 10개(최근 </w:t>
+      </w:r>
+      <w:r>
+        <w:rPr>
+          <w:highlight w:val="yellow"/>
+        </w:rPr>
+        <w:t>3</w:t>
+      </w:r>
+      <w:r>
+        <w:rPr>
+          <w:rFonts w:hint="eastAsia"/>
+          <w:highlight w:val="yellow"/>
+        </w:rPr>
+        <w:t>개년),</w:t>
+      </w:r>
+      <w:r>
+        <w:rPr>
+          <w:highlight w:val="yellow"/>
+        </w:rPr>
+        <w:t xml:space="preserve"> </w:t>
+      </w:r>
+      <w:proofErr w:type="spellStart"/>
+      <w:r>
+        <w:rPr>
+          <w:rFonts w:hint="eastAsia"/>
+          <w:highlight w:val="yellow"/>
+        </w:rPr>
+        <w:t>매출성장률</w:t>
+      </w:r>
+      <w:proofErr w:type="spellEnd"/>
+      <w:r>
+        <w:rPr>
+          <w:rFonts w:hint="eastAsia"/>
+          <w:highlight w:val="yellow"/>
+        </w:rPr>
+        <w:t xml:space="preserve"> 연 </w:t>
+      </w:r>
+      <w:r>
+        <w:rPr>
+          <w:highlight w:val="yellow"/>
+        </w:rPr>
+        <w:t>50%</w:t>
+      </w:r>
+      <w:r>
+        <w:rPr>
+          <w:rFonts w:hint="eastAsia"/>
+          <w:highlight w:val="yellow"/>
+        </w:rPr>
+        <w:t xml:space="preserve">이상 종목 </w:t>
+      </w:r>
+      <w:r>
+        <w:rPr>
+          <w:highlight w:val="yellow"/>
+        </w:rPr>
+        <w:t>10</w:t>
+      </w:r>
+      <w:r>
+        <w:rPr>
+          <w:rFonts w:hint="eastAsia"/>
+          <w:highlight w:val="yellow"/>
+        </w:rPr>
+        <w:t xml:space="preserve">개(최근 </w:t>
+      </w:r>
+      <w:r>
+        <w:rPr>
+          <w:highlight w:val="yellow"/>
+        </w:rPr>
+        <w:t>3</w:t>
+      </w:r>
+      <w:r>
+        <w:rPr>
+          <w:rFonts w:hint="eastAsia"/>
+          <w:highlight w:val="yellow"/>
+        </w:rPr>
+        <w:t>개년)로 분류해줘.</w:t>
       </w:r>
     </w:p>
     <w:p>
@@ -533,194 +718,1783 @@
           <w:numId w:val="1"/>
         </w:numPr>
         <w:ind w:leftChars="0"/>
-        <w:rPr>
-          <w:rFonts w:hint="eastAsia"/>
-          <w:highlight w:val="yellow"/>
-        </w:rPr>
-      </w:pPr>
-      <w:r>
-        <w:rPr>
-          <w:rFonts w:hint="eastAsia"/>
-          <w:highlight w:val="yellow"/>
-        </w:rPr>
-        <w:t xml:space="preserve">메뉴에 추가하여 </w:t>
-      </w:r>
-      <w:r>
-        <w:rPr>
-          <w:highlight w:val="yellow"/>
-        </w:rPr>
-        <w:t>“</w:t>
-      </w:r>
-      <w:r>
-        <w:rPr>
-          <w:rFonts w:hint="eastAsia"/>
-          <w:highlight w:val="yellow"/>
-        </w:rPr>
-        <w:t>가치재평가주</w:t>
-      </w:r>
-      <w:r>
-        <w:rPr>
-          <w:highlight w:val="yellow"/>
-        </w:rPr>
-        <w:t>”</w:t>
-      </w:r>
-      <w:proofErr w:type="spellStart"/>
-      <w:r>
-        <w:rPr>
-          <w:highlight w:val="yellow"/>
+      </w:pPr>
+      <w:r>
+        <w:rPr>
+          <w:rFonts w:hint="eastAsia"/>
+        </w:rPr>
+        <w:t xml:space="preserve">주식을 매수했다가 손실이 </w:t>
+      </w:r>
+      <w:proofErr w:type="spellStart"/>
+      <w:r>
+        <w:rPr>
+          <w:rFonts w:hint="eastAsia"/>
+        </w:rPr>
+        <w:t>날경우</w:t>
+      </w:r>
+      <w:proofErr w:type="spellEnd"/>
+      <w:r>
+        <w:rPr>
+          <w:rFonts w:hint="eastAsia"/>
+        </w:rPr>
+        <w:t>,</w:t>
+      </w:r>
+      <w:r>
+        <w:t xml:space="preserve"> </w:t>
+      </w:r>
+      <w:r>
+        <w:rPr>
+          <w:rFonts w:hint="eastAsia"/>
+        </w:rPr>
+        <w:t>물타기</w:t>
+      </w:r>
+      <w:r>
+        <w:rPr>
+          <w:rFonts w:hint="eastAsia"/>
         </w:rPr>
         <w:t>를</w:t>
       </w:r>
-      <w:proofErr w:type="spellEnd"/>
-      <w:r>
-        <w:rPr>
-          <w:highlight w:val="yellow"/>
-        </w:rPr>
+      <w:r>
+        <w:rPr>
+          <w:rFonts w:hint="eastAsia"/>
+        </w:rPr>
+        <w:t xml:space="preserve"> 해야 하는데 </w:t>
+      </w:r>
+      <w:proofErr w:type="spellStart"/>
+      <w:r>
+        <w:rPr>
+          <w:rFonts w:hint="eastAsia"/>
+        </w:rPr>
+        <w:t>이에따른</w:t>
+      </w:r>
+      <w:proofErr w:type="spellEnd"/>
+      <w:r>
+        <w:rPr>
+          <w:rFonts w:hint="eastAsia"/>
+        </w:rPr>
+        <w:t xml:space="preserve"> 효과적인 규칙을 제시하고, 반대로 주식을 매수했는데 </w:t>
+      </w:r>
+      <w:proofErr w:type="spellStart"/>
+      <w:r>
+        <w:rPr>
+          <w:rFonts w:hint="eastAsia"/>
+        </w:rPr>
+        <w:t>손절매를</w:t>
+      </w:r>
+      <w:proofErr w:type="spellEnd"/>
+      <w:r>
+        <w:rPr>
+          <w:rFonts w:hint="eastAsia"/>
+        </w:rPr>
+        <w:t xml:space="preserve"> 해야 할 경우의 규칙을 제시해 줘. </w:t>
+      </w:r>
+      <w:r>
+        <w:t xml:space="preserve">  </w:t>
+      </w:r>
+    </w:p>
+    <w:p>
+      <w:pPr>
+        <w:pStyle w:val="a3"/>
+        <w:numPr>
+          <w:ilvl w:val="0"/>
+          <w:numId w:val="1"/>
+        </w:numPr>
+        <w:ind w:leftChars="0"/>
+      </w:pPr>
+      <w:bookmarkStart w:id="0" w:name="_GoBack"/>
+      <w:r>
+        <w:rPr>
+          <w:rFonts w:hint="eastAsia"/>
+        </w:rPr>
+        <w:t xml:space="preserve">당신은 </w:t>
+      </w:r>
+      <w:r>
+        <w:t xml:space="preserve">대한민국 KOSPI/KOSDAQ 시장의 당일 </w:t>
+      </w:r>
+      <w:proofErr w:type="spellStart"/>
+      <w:r>
+        <w:t>주도주와</w:t>
+      </w:r>
+      <w:proofErr w:type="spellEnd"/>
+      <w:r>
+        <w:t xml:space="preserve"> 단기 모멘텀을 포착하는 10년 경력의 </w:t>
+      </w:r>
+      <w:proofErr w:type="spellStart"/>
+      <w:r>
+        <w:t>프롭트레이딩</w:t>
+      </w:r>
+      <w:proofErr w:type="spellEnd"/>
+      <w:r>
+        <w:t xml:space="preserve"> '수급 전문 </w:t>
+      </w:r>
+      <w:proofErr w:type="spellStart"/>
+      <w:r>
+        <w:t>애널리스트</w:t>
+      </w:r>
+      <w:proofErr w:type="spellEnd"/>
+      <w:r>
+        <w:t>'이다. 철저히 거래대금과 세력 수급, 가격 변동성을 기준으로 유망 종목을 압축한다</w:t>
+      </w:r>
+      <w:r>
+        <w:rPr>
+          <w:rFonts w:hint="eastAsia"/>
+        </w:rPr>
+        <w:t>.</w:t>
+      </w:r>
+      <w:r>
         <w:t xml:space="preserve"> </w:t>
       </w:r>
       <w:r>
         <w:rPr>
           <w:rFonts w:hint="eastAsia"/>
-          <w:highlight w:val="yellow"/>
-        </w:rPr>
-        <w:t xml:space="preserve">만들고 저 </w:t>
-      </w:r>
-      <w:r>
-        <w:rPr>
-          <w:highlight w:val="yellow"/>
-        </w:rPr>
-        <w:t xml:space="preserve">PBR </w:t>
-      </w:r>
-      <w:r>
-        <w:rPr>
-          <w:rFonts w:hint="eastAsia"/>
-          <w:highlight w:val="yellow"/>
-        </w:rPr>
-        <w:t xml:space="preserve">종목(상위 </w:t>
-      </w:r>
-      <w:r>
-        <w:rPr>
-          <w:highlight w:val="yellow"/>
-        </w:rPr>
-        <w:t>10</w:t>
-      </w:r>
-      <w:r>
-        <w:rPr>
-          <w:rFonts w:hint="eastAsia"/>
-          <w:highlight w:val="yellow"/>
-        </w:rPr>
-        <w:t>개)</w:t>
-      </w:r>
-      <w:r>
-        <w:rPr>
-          <w:highlight w:val="yellow"/>
-        </w:rPr>
-        <w:t xml:space="preserve">, </w:t>
-      </w:r>
-      <w:proofErr w:type="spellStart"/>
-      <w:r>
-        <w:rPr>
-          <w:rFonts w:hint="eastAsia"/>
-          <w:highlight w:val="yellow"/>
-        </w:rPr>
-        <w:t>매출이익</w:t>
-      </w:r>
-      <w:proofErr w:type="spellEnd"/>
-      <w:r>
-        <w:rPr>
-          <w:rFonts w:hint="eastAsia"/>
-          <w:highlight w:val="yellow"/>
-        </w:rPr>
+        </w:rPr>
+        <w:t xml:space="preserve">이에 따른 </w:t>
+      </w:r>
+      <w:r>
+        <w:t>[Core Workflow]</w:t>
+      </w:r>
+      <w:r>
+        <w:rPr>
+          <w:rFonts w:hint="eastAsia"/>
+        </w:rPr>
+        <w:t>는,</w:t>
+      </w:r>
+      <w:r>
         <w:t xml:space="preserve"> </w:t>
       </w:r>
-      <w:r>
-        <w:rPr>
-          <w:highlight w:val="yellow"/>
-        </w:rPr>
-        <w:t>40%</w:t>
-      </w:r>
-      <w:r>
-        <w:rPr>
-          <w:rFonts w:hint="eastAsia"/>
-          <w:highlight w:val="yellow"/>
-        </w:rPr>
-        <w:t xml:space="preserve">이상인 종목 10개(최근 </w:t>
-      </w:r>
-      <w:r>
-        <w:rPr>
-          <w:highlight w:val="yellow"/>
-        </w:rPr>
-        <w:t>3</w:t>
-      </w:r>
-      <w:r>
-        <w:rPr>
-          <w:rFonts w:hint="eastAsia"/>
-          <w:highlight w:val="yellow"/>
-        </w:rPr>
-        <w:t>개년),</w:t>
-      </w:r>
-      <w:r>
-        <w:rPr>
-          <w:highlight w:val="yellow"/>
-        </w:rPr>
+    </w:p>
+    <w:p>
+      <w:pPr>
+        <w:ind w:left="760"/>
+      </w:pPr>
+      <w:r>
+        <w:t xml:space="preserve">- </w:t>
+      </w:r>
+      <w:r>
+        <w:t>시장이 마감되면 `</w:t>
+      </w:r>
+      <w:proofErr w:type="spellStart"/>
+      <w:r>
+        <w:t>fetch_market_momentum</w:t>
+      </w:r>
+      <w:proofErr w:type="spellEnd"/>
+      <w:r>
+        <w:t>` 스킬을 사용하여 거래대금이 전일 대비 200% 이상 폭발했거나, 최근 5일 내 최고 거래대금을 갱신한 종목을 1차 필터링하라.</w:t>
+      </w:r>
+    </w:p>
+    <w:p>
+      <w:pPr>
+        <w:ind w:left="760"/>
+      </w:pPr>
+      <w:r>
+        <w:t xml:space="preserve">- </w:t>
+      </w:r>
+      <w:r>
+        <w:t xml:space="preserve">1차 </w:t>
+      </w:r>
+      <w:proofErr w:type="spellStart"/>
+      <w:r>
+        <w:t>필터링된</w:t>
+      </w:r>
+      <w:proofErr w:type="spellEnd"/>
+      <w:r>
+        <w:t xml:space="preserve"> 종목들에 대해 `</w:t>
+      </w:r>
+      <w:proofErr w:type="spellStart"/>
+      <w:r>
+        <w:t>analyze_supply_demand</w:t>
+      </w:r>
+      <w:proofErr w:type="spellEnd"/>
+      <w:r>
+        <w:t>`</w:t>
+      </w:r>
+      <w:proofErr w:type="spellStart"/>
+      <w:r>
+        <w:t>를</w:t>
+      </w:r>
+      <w:proofErr w:type="spellEnd"/>
+      <w:r>
+        <w:t xml:space="preserve"> 실행하여 외국인과 기관의 '의미 있는 수급 유입'이 있는지, 혹은 단순히 개인의 투기성 자금인지 판별하라.</w:t>
+      </w:r>
+    </w:p>
+    <w:p>
+      <w:pPr>
+        <w:ind w:left="760"/>
+      </w:pPr>
+      <w:r>
+        <w:t xml:space="preserve">- </w:t>
+      </w:r>
+      <w:r>
+        <w:t>수급이 확인된 종목은 `</w:t>
+      </w:r>
+      <w:proofErr w:type="spellStart"/>
+      <w:r>
+        <w:t>scan_theme_news</w:t>
+      </w:r>
+      <w:proofErr w:type="spellEnd"/>
+      <w:r>
+        <w:t>`</w:t>
+      </w:r>
+      <w:proofErr w:type="spellStart"/>
+      <w:r>
+        <w:t>를</w:t>
+      </w:r>
+      <w:proofErr w:type="spellEnd"/>
+      <w:r>
+        <w:t xml:space="preserve"> 통해 상승의 재료(모멘텀)가 무엇인지 파악하고 가짜 뉴스를 걸러내라.</w:t>
+      </w:r>
+    </w:p>
+    <w:p>
+      <w:pPr>
+        <w:ind w:firstLineChars="400" w:firstLine="800"/>
+      </w:pPr>
+      <w:r>
+        <w:t xml:space="preserve">보고서는 반드시 다음 구조를 지켜 </w:t>
+      </w:r>
+      <w:proofErr w:type="spellStart"/>
+      <w:r>
+        <w:t>마크다운</w:t>
+      </w:r>
+      <w:proofErr w:type="spellEnd"/>
+      <w:r>
+        <w:t xml:space="preserve"> 형식으로 출력하라:</w:t>
+      </w:r>
+    </w:p>
+    <w:p>
+      <w:r>
+        <w:t xml:space="preserve">  </w:t>
+      </w:r>
+      <w:r>
+        <w:tab/>
+      </w:r>
+      <w:r>
+        <w:tab/>
+      </w:r>
+      <w:r>
+        <w:t>### [</w:t>
+      </w:r>
+      <w:proofErr w:type="spellStart"/>
+      <w:r>
+        <w:t>종목명</w:t>
+      </w:r>
+      <w:proofErr w:type="spellEnd"/>
+      <w:r>
+        <w:t xml:space="preserve"> (코드)] - 모멘텀 점수 (1~10점)</w:t>
+      </w:r>
+    </w:p>
+    <w:p>
+      <w:r>
+        <w:t xml:space="preserve">  </w:t>
+      </w:r>
+      <w:r>
+        <w:tab/>
+      </w:r>
+      <w:r>
+        <w:tab/>
+      </w:r>
+      <w:r>
+        <w:t>- **수급 현황**: 외인/기관 동향 요약 및 거래대금 규모</w:t>
+      </w:r>
+    </w:p>
+    <w:p>
+      <w:r>
+        <w:t xml:space="preserve">  </w:t>
+      </w:r>
+      <w:r>
+        <w:tab/>
+      </w:r>
+      <w:r>
+        <w:tab/>
+      </w:r>
+      <w:r>
+        <w:t xml:space="preserve">- **차트 위치**: 주요 </w:t>
+      </w:r>
+      <w:proofErr w:type="spellStart"/>
+      <w:r>
+        <w:t>이평선</w:t>
+      </w:r>
+      <w:proofErr w:type="spellEnd"/>
+      <w:r>
         <w:t xml:space="preserve"> </w:t>
       </w:r>
       <w:proofErr w:type="spellStart"/>
       <w:r>
-        <w:rPr>
-          <w:rFonts w:hint="eastAsia"/>
-          <w:highlight w:val="yellow"/>
-        </w:rPr>
-        <w:t>매출성장률</w:t>
-      </w:r>
-      <w:proofErr w:type="spellEnd"/>
-      <w:r>
-        <w:rPr>
-          <w:rFonts w:hint="eastAsia"/>
-          <w:highlight w:val="yellow"/>
-        </w:rPr>
-        <w:t xml:space="preserve"> 연 </w:t>
-      </w:r>
-      <w:r>
-        <w:rPr>
-          <w:highlight w:val="yellow"/>
-        </w:rPr>
-        <w:t>50%</w:t>
-      </w:r>
-      <w:r>
-        <w:rPr>
-          <w:rFonts w:hint="eastAsia"/>
-          <w:highlight w:val="yellow"/>
-        </w:rPr>
-        <w:t xml:space="preserve">이상 종목 </w:t>
-      </w:r>
-      <w:r>
-        <w:rPr>
-          <w:highlight w:val="yellow"/>
-        </w:rPr>
-        <w:t>10</w:t>
-      </w:r>
-      <w:r>
-        <w:rPr>
-          <w:rFonts w:hint="eastAsia"/>
-          <w:highlight w:val="yellow"/>
-        </w:rPr>
-        <w:t xml:space="preserve">개(최근 </w:t>
-      </w:r>
-      <w:r>
-        <w:rPr>
-          <w:highlight w:val="yellow"/>
-        </w:rPr>
-        <w:t>3</w:t>
-      </w:r>
-      <w:r>
-        <w:rPr>
-          <w:rFonts w:hint="eastAsia"/>
-          <w:highlight w:val="yellow"/>
-        </w:rPr>
-        <w:t>개년)로 분류해줘.</w:t>
-      </w:r>
-    </w:p>
+        <w:t>이격도</w:t>
+      </w:r>
+      <w:proofErr w:type="spellEnd"/>
+      <w:r>
+        <w:t xml:space="preserve"> 및 단기 저항선 위치</w:t>
+      </w:r>
+    </w:p>
+    <w:p>
+      <w:r>
+        <w:t xml:space="preserve">  </w:t>
+      </w:r>
+      <w:r>
+        <w:tab/>
+      </w:r>
+      <w:r>
+        <w:tab/>
+      </w:r>
+      <w:r>
+        <w:t>- **재료 분석**: 상승을 이끈 핵심 뉴스 한 줄 요약 및 테마 지속성 평가</w:t>
+      </w:r>
+    </w:p>
+    <w:p>
+      <w:r>
+        <w:lastRenderedPageBreak/>
+        <w:t xml:space="preserve"> </w:t>
+      </w:r>
+      <w:r>
+        <w:tab/>
+      </w:r>
+      <w:r>
+        <w:tab/>
+      </w:r>
+      <w:r>
+        <w:t xml:space="preserve">- **트레이딩 시나리오**: 내일 시초가 진입 기준 타점 및 </w:t>
+      </w:r>
+      <w:proofErr w:type="spellStart"/>
+      <w:r>
+        <w:t>손절선</w:t>
+      </w:r>
+      <w:proofErr w:type="spellEnd"/>
+      <w:r>
+        <w:t>(Stop-loss) 제안</w:t>
+      </w:r>
+    </w:p>
+    <w:p>
+      <w:pPr>
+        <w:ind w:left="1600"/>
+      </w:pPr>
+      <w:r>
+        <w:t xml:space="preserve">- 절대 이미 급등하여 단기 과열(RSI 80 이상) 상태이거나, 거래대금이 500억 미만인 </w:t>
+      </w:r>
+      <w:proofErr w:type="spellStart"/>
+      <w:r>
+        <w:t>소외주는</w:t>
+      </w:r>
+      <w:proofErr w:type="spellEnd"/>
+      <w:r>
+        <w:t xml:space="preserve"> 추천 리스트에 올리지 마라.</w:t>
+      </w:r>
+    </w:p>
+    <w:p>
+      <w:pPr>
+        <w:ind w:left="1600"/>
+      </w:pPr>
+      <w:r>
+        <w:t>- "감"이나 "추측"</w:t>
+      </w:r>
+      <w:proofErr w:type="spellStart"/>
+      <w:r>
+        <w:t>으로</w:t>
+      </w:r>
+      <w:proofErr w:type="spellEnd"/>
+      <w:r>
+        <w:t xml:space="preserve"> 말하지 말고, 스킬을 통해 얻은 데이터(Data-driven)에 </w:t>
+      </w:r>
+      <w:proofErr w:type="spellStart"/>
+      <w:r>
+        <w:t>기반해서만</w:t>
+      </w:r>
+      <w:proofErr w:type="spellEnd"/>
+      <w:r>
+        <w:t xml:space="preserve"> 의견을 작성하라.</w:t>
+      </w:r>
+    </w:p>
+    <w:p/>
+    <w:p>
+      <w:pPr>
+        <w:pStyle w:val="a3"/>
+        <w:numPr>
+          <w:ilvl w:val="0"/>
+          <w:numId w:val="1"/>
+        </w:numPr>
+        <w:ind w:leftChars="0"/>
+        <w:rPr>
+          <w:rFonts w:asciiTheme="minorEastAsia" w:hAnsiTheme="minorEastAsia"/>
+          <w:szCs w:val="20"/>
+        </w:rPr>
+      </w:pPr>
+      <w:r>
+        <w:rPr>
+          <w:rFonts w:asciiTheme="minorEastAsia" w:hAnsiTheme="minorEastAsia"/>
+          <w:szCs w:val="20"/>
+        </w:rPr>
+        <w:t xml:space="preserve">매일 아침 장 시작 전에 "어제 에이전트가 뽑은 종목이 오늘 실제로 어떻게 움직였는가?"를 추적하는 </w:t>
+      </w:r>
+      <w:r>
+        <w:rPr>
+          <w:rStyle w:val="HTML"/>
+          <w:rFonts w:asciiTheme="minorEastAsia" w:eastAsiaTheme="minorEastAsia" w:hAnsiTheme="minorEastAsia"/>
+          <w:sz w:val="20"/>
+          <w:szCs w:val="20"/>
+        </w:rPr>
+        <w:t>validate_predictions.py</w:t>
+      </w:r>
+      <w:r>
+        <w:rPr>
+          <w:rFonts w:asciiTheme="minorEastAsia" w:hAnsiTheme="minorEastAsia"/>
+          <w:szCs w:val="20"/>
+        </w:rPr>
+        <w:t xml:space="preserve"> 스크립트를 하나 더 추가</w:t>
+      </w:r>
+      <w:r>
+        <w:rPr>
+          <w:rFonts w:asciiTheme="minorEastAsia" w:hAnsiTheme="minorEastAsia" w:hint="eastAsia"/>
+          <w:szCs w:val="20"/>
+        </w:rPr>
+        <w:t>(</w:t>
+      </w:r>
+      <w:proofErr w:type="spellStart"/>
+      <w:r>
+        <w:rPr>
+          <w:rFonts w:asciiTheme="minorEastAsia" w:hAnsiTheme="minorEastAsia" w:hint="eastAsia"/>
+          <w:szCs w:val="20"/>
+        </w:rPr>
+        <w:t>예를들어</w:t>
+      </w:r>
+      <w:proofErr w:type="spellEnd"/>
+      <w:r>
+        <w:rPr>
+          <w:rFonts w:asciiTheme="minorEastAsia" w:hAnsiTheme="minorEastAsia" w:hint="eastAsia"/>
+          <w:szCs w:val="20"/>
+        </w:rPr>
+        <w:t xml:space="preserve"> </w:t>
+      </w:r>
+      <w:r>
+        <w:rPr>
+          <w:rFonts w:asciiTheme="minorEastAsia" w:hAnsiTheme="minorEastAsia"/>
+          <w:b/>
+          <w:bCs/>
+          <w:szCs w:val="20"/>
+        </w:rPr>
+        <w:t>"내가 재료 해석을 너무 과하게 했구나"</w:t>
+      </w:r>
+      <w:r>
+        <w:rPr>
+          <w:rFonts w:asciiTheme="minorEastAsia" w:hAnsiTheme="minorEastAsia"/>
+          <w:szCs w:val="20"/>
+        </w:rPr>
+        <w:t xml:space="preserve"> 혹은 </w:t>
+      </w:r>
+      <w:r>
+        <w:rPr>
+          <w:rFonts w:asciiTheme="minorEastAsia" w:hAnsiTheme="minorEastAsia"/>
+          <w:b/>
+          <w:bCs/>
+          <w:szCs w:val="20"/>
+        </w:rPr>
+        <w:t xml:space="preserve">"수급 유입 규모 기준을 더 </w:t>
+      </w:r>
+      <w:proofErr w:type="spellStart"/>
+      <w:r>
+        <w:rPr>
+          <w:rFonts w:asciiTheme="minorEastAsia" w:hAnsiTheme="minorEastAsia"/>
+          <w:b/>
+          <w:bCs/>
+          <w:szCs w:val="20"/>
+        </w:rPr>
+        <w:t>높여야겠구나</w:t>
+      </w:r>
+      <w:proofErr w:type="spellEnd"/>
+      <w:r>
+        <w:rPr>
+          <w:rFonts w:asciiTheme="minorEastAsia" w:hAnsiTheme="minorEastAsia"/>
+          <w:b/>
+          <w:bCs/>
+          <w:szCs w:val="20"/>
+        </w:rPr>
+        <w:t>"</w:t>
+      </w:r>
+      <w:r>
+        <w:rPr>
+          <w:rFonts w:asciiTheme="minorEastAsia" w:hAnsiTheme="minorEastAsia"/>
+          <w:szCs w:val="20"/>
+        </w:rPr>
+        <w:t xml:space="preserve"> 같은 자체 피드백</w:t>
+      </w:r>
+      <w:r>
+        <w:rPr>
+          <w:rFonts w:asciiTheme="minorEastAsia" w:hAnsiTheme="minorEastAsia" w:hint="eastAsia"/>
+          <w:szCs w:val="20"/>
+        </w:rPr>
+        <w:t>) 요망</w:t>
+      </w:r>
+    </w:p>
+    <w:p>
+      <w:pPr>
+        <w:pStyle w:val="a3"/>
+        <w:numPr>
+          <w:ilvl w:val="0"/>
+          <w:numId w:val="1"/>
+        </w:numPr>
+        <w:ind w:leftChars="0"/>
+        <w:rPr>
+          <w:rFonts w:asciiTheme="minorEastAsia" w:hAnsiTheme="minorEastAsia" w:hint="eastAsia"/>
+          <w:szCs w:val="20"/>
+        </w:rPr>
+      </w:pPr>
+      <w:r>
+        <w:rPr>
+          <w:rFonts w:asciiTheme="minorEastAsia" w:hAnsiTheme="minorEastAsia" w:cs="굴림"/>
+          <w:kern w:val="0"/>
+          <w:szCs w:val="20"/>
+        </w:rPr>
+        <w:t xml:space="preserve">증권 전문가 관점에서 </w:t>
+      </w:r>
+      <w:r>
+        <w:rPr>
+          <w:rFonts w:asciiTheme="minorEastAsia" w:hAnsiTheme="minorEastAsia" w:cs="굴림"/>
+          <w:b/>
+          <w:bCs/>
+          <w:kern w:val="0"/>
+          <w:szCs w:val="20"/>
+        </w:rPr>
+        <w:t xml:space="preserve">AI </w:t>
+      </w:r>
+      <w:proofErr w:type="spellStart"/>
+      <w:r>
+        <w:rPr>
+          <w:rFonts w:asciiTheme="minorEastAsia" w:hAnsiTheme="minorEastAsia" w:cs="굴림"/>
+          <w:b/>
+          <w:bCs/>
+          <w:kern w:val="0"/>
+          <w:szCs w:val="20"/>
+        </w:rPr>
+        <w:t>애널리스트</w:t>
+      </w:r>
+      <w:proofErr w:type="spellEnd"/>
+      <w:r>
+        <w:rPr>
+          <w:rFonts w:asciiTheme="minorEastAsia" w:hAnsiTheme="minorEastAsia" w:cs="굴림"/>
+          <w:b/>
+          <w:bCs/>
+          <w:kern w:val="0"/>
+          <w:szCs w:val="20"/>
+        </w:rPr>
+        <w:t xml:space="preserve"> 수준의 정교함과 실전 투자 가치</w:t>
+      </w:r>
+      <w:r>
+        <w:rPr>
+          <w:rFonts w:asciiTheme="minorEastAsia" w:hAnsiTheme="minorEastAsia" w:cs="굴림"/>
+          <w:kern w:val="0"/>
+          <w:szCs w:val="20"/>
+        </w:rPr>
+        <w:t>를 갖추기 위해 프로그램에 반영해야 할 핵심 기능과 프롬프트/스킬 설계 항목을 4가지</w:t>
+      </w:r>
+      <w:r>
+        <w:rPr>
+          <w:rFonts w:asciiTheme="minorEastAsia" w:hAnsiTheme="minorEastAsia" w:cs="굴림" w:hint="eastAsia"/>
+          <w:kern w:val="0"/>
+          <w:szCs w:val="20"/>
+        </w:rPr>
+        <w:t xml:space="preserve">로 구분하여 설명하니 </w:t>
+      </w:r>
+      <w:proofErr w:type="spellStart"/>
+      <w:r>
+        <w:rPr>
+          <w:rFonts w:asciiTheme="minorEastAsia" w:hAnsiTheme="minorEastAsia" w:cs="굴림" w:hint="eastAsia"/>
+          <w:kern w:val="0"/>
+          <w:szCs w:val="20"/>
+        </w:rPr>
+        <w:t>반영요망</w:t>
+      </w:r>
+      <w:proofErr w:type="spellEnd"/>
+      <w:r>
+        <w:rPr>
+          <w:rFonts w:asciiTheme="minorEastAsia" w:hAnsiTheme="minorEastAsia" w:cs="굴림" w:hint="eastAsia"/>
+          <w:kern w:val="0"/>
+          <w:szCs w:val="20"/>
+        </w:rPr>
+        <w:t>.</w:t>
+      </w:r>
+    </w:p>
+    <w:p>
+      <w:pPr>
+        <w:widowControl/>
+        <w:wordWrap/>
+        <w:autoSpaceDE/>
+        <w:autoSpaceDN/>
+        <w:spacing w:before="100" w:beforeAutospacing="1" w:after="100" w:afterAutospacing="1" w:line="240" w:lineRule="auto"/>
+        <w:ind w:firstLine="760"/>
+        <w:jc w:val="left"/>
+        <w:outlineLvl w:val="1"/>
+        <w:rPr>
+          <w:rFonts w:asciiTheme="minorEastAsia" w:hAnsiTheme="minorEastAsia" w:cs="굴림"/>
+          <w:b/>
+          <w:bCs/>
+          <w:kern w:val="0"/>
+          <w:szCs w:val="20"/>
+        </w:rPr>
+      </w:pPr>
+      <w:r>
+        <w:rPr>
+          <w:rFonts w:asciiTheme="minorEastAsia" w:hAnsiTheme="minorEastAsia" w:cs="굴림"/>
+          <w:b/>
+          <w:bCs/>
+          <w:kern w:val="0"/>
+          <w:szCs w:val="20"/>
+        </w:rPr>
+        <w:t>1)</w:t>
+      </w:r>
+      <w:r>
+        <w:rPr>
+          <w:rFonts w:asciiTheme="minorEastAsia" w:hAnsiTheme="minorEastAsia" w:cs="굴림"/>
+          <w:b/>
+          <w:bCs/>
+          <w:kern w:val="0"/>
+          <w:szCs w:val="20"/>
+        </w:rPr>
+        <w:t xml:space="preserve"> 정량 분석 엔진 (기본적 분석 자동화)</w:t>
+      </w:r>
+    </w:p>
+    <w:p>
+      <w:pPr>
+        <w:widowControl/>
+        <w:wordWrap/>
+        <w:autoSpaceDE/>
+        <w:autoSpaceDN/>
+        <w:spacing w:before="100" w:beforeAutospacing="1" w:after="100" w:afterAutospacing="1" w:line="240" w:lineRule="auto"/>
+        <w:ind w:left="720" w:firstLine="40"/>
+        <w:jc w:val="left"/>
+        <w:rPr>
+          <w:rFonts w:asciiTheme="minorEastAsia" w:hAnsiTheme="minorEastAsia" w:cs="굴림"/>
+          <w:kern w:val="0"/>
+          <w:szCs w:val="20"/>
+        </w:rPr>
+      </w:pPr>
+      <w:r>
+        <w:rPr>
+          <w:rFonts w:asciiTheme="minorEastAsia" w:hAnsiTheme="minorEastAsia" w:cs="굴림"/>
+          <w:kern w:val="0"/>
+          <w:szCs w:val="20"/>
+        </w:rPr>
+        <w:t xml:space="preserve">AI 에이전트가 사람이 수작업으로 필터링하는 재무 지표를 자동으로 </w:t>
+      </w:r>
+      <w:proofErr w:type="spellStart"/>
+      <w:r>
+        <w:rPr>
+          <w:rFonts w:asciiTheme="minorEastAsia" w:hAnsiTheme="minorEastAsia" w:cs="굴림"/>
+          <w:kern w:val="0"/>
+          <w:szCs w:val="20"/>
+        </w:rPr>
+        <w:t>스크리닝하고</w:t>
+      </w:r>
+      <w:proofErr w:type="spellEnd"/>
+      <w:r>
+        <w:rPr>
+          <w:rFonts w:asciiTheme="minorEastAsia" w:hAnsiTheme="minorEastAsia" w:cs="굴림"/>
+          <w:kern w:val="0"/>
+          <w:szCs w:val="20"/>
+        </w:rPr>
+        <w:t xml:space="preserve"> 정제하도록 스킬(</w:t>
+      </w:r>
+      <w:r>
+        <w:rPr>
+          <w:rFonts w:asciiTheme="minorEastAsia" w:hAnsiTheme="minorEastAsia" w:cs="굴림체"/>
+          <w:kern w:val="0"/>
+          <w:szCs w:val="20"/>
+        </w:rPr>
+        <w:t>SKILL.md</w:t>
+      </w:r>
+      <w:r>
+        <w:rPr>
+          <w:rFonts w:asciiTheme="minorEastAsia" w:hAnsiTheme="minorEastAsia" w:cs="굴림"/>
+          <w:kern w:val="0"/>
+          <w:szCs w:val="20"/>
+        </w:rPr>
+        <w:t>)을 정의해야 합니다.</w:t>
+      </w:r>
+    </w:p>
+    <w:p>
+      <w:pPr>
+        <w:widowControl/>
+        <w:numPr>
+          <w:ilvl w:val="0"/>
+          <w:numId w:val="2"/>
+        </w:numPr>
+        <w:wordWrap/>
+        <w:autoSpaceDE/>
+        <w:autoSpaceDN/>
+        <w:spacing w:before="100" w:beforeAutospacing="1" w:after="100" w:afterAutospacing="1" w:line="240" w:lineRule="auto"/>
+        <w:jc w:val="left"/>
+        <w:rPr>
+          <w:rFonts w:asciiTheme="minorEastAsia" w:hAnsiTheme="minorEastAsia" w:cs="굴림"/>
+          <w:kern w:val="0"/>
+          <w:szCs w:val="20"/>
+        </w:rPr>
+      </w:pPr>
+      <w:proofErr w:type="spellStart"/>
+      <w:r>
+        <w:rPr>
+          <w:rFonts w:asciiTheme="minorEastAsia" w:hAnsiTheme="minorEastAsia" w:cs="굴림"/>
+          <w:b/>
+          <w:bCs/>
+          <w:kern w:val="0"/>
+          <w:szCs w:val="20"/>
+        </w:rPr>
+        <w:t>멀티플</w:t>
+      </w:r>
+      <w:proofErr w:type="spellEnd"/>
+      <w:r>
+        <w:rPr>
+          <w:rFonts w:asciiTheme="minorEastAsia" w:hAnsiTheme="minorEastAsia" w:cs="굴림"/>
+          <w:b/>
+          <w:bCs/>
+          <w:kern w:val="0"/>
+          <w:szCs w:val="20"/>
+        </w:rPr>
+        <w:t xml:space="preserve"> 밸류에이션 </w:t>
+      </w:r>
+      <w:proofErr w:type="spellStart"/>
+      <w:r>
+        <w:rPr>
+          <w:rFonts w:asciiTheme="minorEastAsia" w:hAnsiTheme="minorEastAsia" w:cs="굴림"/>
+          <w:b/>
+          <w:bCs/>
+          <w:kern w:val="0"/>
+          <w:szCs w:val="20"/>
+        </w:rPr>
+        <w:t>스크리닝</w:t>
+      </w:r>
+      <w:proofErr w:type="spellEnd"/>
+      <w:r>
+        <w:rPr>
+          <w:rFonts w:asciiTheme="minorEastAsia" w:hAnsiTheme="minorEastAsia" w:cs="굴림"/>
+          <w:b/>
+          <w:bCs/>
+          <w:kern w:val="0"/>
+          <w:szCs w:val="20"/>
+        </w:rPr>
+        <w:t>:</w:t>
+      </w:r>
+      <w:r>
+        <w:rPr>
+          <w:rFonts w:asciiTheme="minorEastAsia" w:hAnsiTheme="minorEastAsia" w:cs="굴림"/>
+          <w:kern w:val="0"/>
+          <w:szCs w:val="20"/>
+        </w:rPr>
+        <w:t xml:space="preserve"> 단순 PER, PBR 조회를 넘어, 업종별 특성에 맞는 지표(예: 제조업의 경우 가동률 및 재고 자산 회전율, 2차전지/기술주의 경우 </w:t>
+      </w:r>
+      <w:proofErr w:type="spellStart"/>
+      <w:r>
+        <w:rPr>
+          <w:rFonts w:asciiTheme="minorEastAsia" w:hAnsiTheme="minorEastAsia" w:cs="굴림"/>
+          <w:kern w:val="0"/>
+          <w:szCs w:val="20"/>
+        </w:rPr>
+        <w:t>밸류체인</w:t>
+      </w:r>
+      <w:proofErr w:type="spellEnd"/>
+      <w:r>
+        <w:rPr>
+          <w:rFonts w:asciiTheme="minorEastAsia" w:hAnsiTheme="minorEastAsia" w:cs="굴림"/>
+          <w:kern w:val="0"/>
+          <w:szCs w:val="20"/>
+        </w:rPr>
+        <w:t xml:space="preserve"> 내 </w:t>
+      </w:r>
+      <w:proofErr w:type="spellStart"/>
+      <w:r>
+        <w:rPr>
+          <w:rFonts w:asciiTheme="minorEastAsia" w:hAnsiTheme="minorEastAsia" w:cs="굴림"/>
+          <w:kern w:val="0"/>
+          <w:szCs w:val="20"/>
+        </w:rPr>
+        <w:t>캐펙스</w:t>
+      </w:r>
+      <w:proofErr w:type="spellEnd"/>
+      <w:r>
+        <w:rPr>
+          <w:rFonts w:asciiTheme="minorEastAsia" w:hAnsiTheme="minorEastAsia" w:cs="굴림"/>
+          <w:kern w:val="0"/>
+          <w:szCs w:val="20"/>
+        </w:rPr>
+        <w:t xml:space="preserve">(CAPEX) 투자 추이)를 Open DART API나 </w:t>
+      </w:r>
+      <w:proofErr w:type="spellStart"/>
+      <w:r>
+        <w:rPr>
+          <w:rFonts w:asciiTheme="minorEastAsia" w:hAnsiTheme="minorEastAsia" w:cs="굴림체"/>
+          <w:kern w:val="0"/>
+          <w:szCs w:val="20"/>
+        </w:rPr>
+        <w:t>yfinance</w:t>
+      </w:r>
+      <w:proofErr w:type="spellEnd"/>
+      <w:r>
+        <w:rPr>
+          <w:rFonts w:asciiTheme="minorEastAsia" w:hAnsiTheme="minorEastAsia" w:cs="굴림"/>
+          <w:kern w:val="0"/>
+          <w:szCs w:val="20"/>
+        </w:rPr>
+        <w:t>를 통해 수집하게 합니다.</w:t>
+      </w:r>
+    </w:p>
+    <w:p>
+      <w:pPr>
+        <w:widowControl/>
+        <w:numPr>
+          <w:ilvl w:val="0"/>
+          <w:numId w:val="2"/>
+        </w:numPr>
+        <w:wordWrap/>
+        <w:autoSpaceDE/>
+        <w:autoSpaceDN/>
+        <w:spacing w:before="100" w:beforeAutospacing="1" w:after="100" w:afterAutospacing="1" w:line="240" w:lineRule="auto"/>
+        <w:jc w:val="left"/>
+        <w:rPr>
+          <w:rFonts w:asciiTheme="minorEastAsia" w:hAnsiTheme="minorEastAsia" w:cs="굴림"/>
+          <w:kern w:val="0"/>
+          <w:szCs w:val="20"/>
+        </w:rPr>
+      </w:pPr>
+      <w:r>
+        <w:rPr>
+          <w:rFonts w:asciiTheme="minorEastAsia" w:hAnsiTheme="minorEastAsia" w:cs="굴림"/>
+          <w:b/>
+          <w:bCs/>
+          <w:kern w:val="0"/>
+          <w:szCs w:val="20"/>
+        </w:rPr>
+        <w:t>컨센서스 추이 추적:</w:t>
+      </w:r>
+      <w:r>
+        <w:rPr>
+          <w:rFonts w:asciiTheme="minorEastAsia" w:hAnsiTheme="minorEastAsia" w:cs="굴림"/>
+          <w:kern w:val="0"/>
+          <w:szCs w:val="20"/>
+        </w:rPr>
+        <w:t xml:space="preserve"> 에이전트가 주요 증권사의 </w:t>
+      </w:r>
+      <w:proofErr w:type="spellStart"/>
+      <w:r>
+        <w:rPr>
+          <w:rFonts w:asciiTheme="minorEastAsia" w:hAnsiTheme="minorEastAsia" w:cs="굴림"/>
+          <w:kern w:val="0"/>
+          <w:szCs w:val="20"/>
+        </w:rPr>
+        <w:t>에프앤가이드</w:t>
+      </w:r>
+      <w:proofErr w:type="spellEnd"/>
+      <w:r>
+        <w:rPr>
+          <w:rFonts w:asciiTheme="minorEastAsia" w:hAnsiTheme="minorEastAsia" w:cs="굴림"/>
+          <w:kern w:val="0"/>
+          <w:szCs w:val="20"/>
+        </w:rPr>
+        <w:t>(</w:t>
+      </w:r>
+      <w:proofErr w:type="spellStart"/>
+      <w:r>
+        <w:rPr>
+          <w:rFonts w:asciiTheme="minorEastAsia" w:hAnsiTheme="minorEastAsia" w:cs="굴림"/>
+          <w:kern w:val="0"/>
+          <w:szCs w:val="20"/>
+        </w:rPr>
+        <w:t>FnGuide</w:t>
+      </w:r>
+      <w:proofErr w:type="spellEnd"/>
+      <w:r>
+        <w:rPr>
+          <w:rFonts w:asciiTheme="minorEastAsia" w:hAnsiTheme="minorEastAsia" w:cs="굴림"/>
+          <w:kern w:val="0"/>
+          <w:szCs w:val="20"/>
+        </w:rPr>
+        <w:t xml:space="preserve">)나 </w:t>
+      </w:r>
+      <w:proofErr w:type="spellStart"/>
+      <w:r>
+        <w:rPr>
+          <w:rFonts w:asciiTheme="minorEastAsia" w:hAnsiTheme="minorEastAsia" w:cs="굴림"/>
+          <w:kern w:val="0"/>
+          <w:szCs w:val="20"/>
+        </w:rPr>
+        <w:t>네이버페이</w:t>
+      </w:r>
+      <w:proofErr w:type="spellEnd"/>
+      <w:r>
+        <w:rPr>
+          <w:rFonts w:asciiTheme="minorEastAsia" w:hAnsiTheme="minorEastAsia" w:cs="굴림"/>
+          <w:kern w:val="0"/>
+          <w:szCs w:val="20"/>
+        </w:rPr>
+        <w:t xml:space="preserve"> 증권 등의 목표주가 및 영업이익 컨센서스 변화 추이(상향/하향 조정 여부)를 </w:t>
+      </w:r>
+      <w:proofErr w:type="spellStart"/>
+      <w:r>
+        <w:rPr>
+          <w:rFonts w:asciiTheme="minorEastAsia" w:hAnsiTheme="minorEastAsia" w:cs="굴림"/>
+          <w:kern w:val="0"/>
+          <w:szCs w:val="20"/>
+        </w:rPr>
+        <w:t>시계열로</w:t>
+      </w:r>
+      <w:proofErr w:type="spellEnd"/>
+      <w:r>
+        <w:rPr>
+          <w:rFonts w:asciiTheme="minorEastAsia" w:hAnsiTheme="minorEastAsia" w:cs="굴림"/>
+          <w:kern w:val="0"/>
+          <w:szCs w:val="20"/>
+        </w:rPr>
+        <w:t xml:space="preserve"> 정제하여 '기대치 변화 모멘텀'을 계산하도록 스크립트를 연결합니다.</w:t>
+      </w:r>
+    </w:p>
+    <w:p>
+      <w:pPr>
+        <w:widowControl/>
+        <w:wordWrap/>
+        <w:autoSpaceDE/>
+        <w:autoSpaceDN/>
+        <w:spacing w:before="100" w:beforeAutospacing="1" w:after="100" w:afterAutospacing="1" w:line="240" w:lineRule="auto"/>
+        <w:ind w:firstLine="720"/>
+        <w:jc w:val="left"/>
+        <w:outlineLvl w:val="1"/>
+        <w:rPr>
+          <w:rFonts w:asciiTheme="minorEastAsia" w:hAnsiTheme="minorEastAsia" w:cs="굴림"/>
+          <w:b/>
+          <w:bCs/>
+          <w:kern w:val="0"/>
+          <w:szCs w:val="20"/>
+        </w:rPr>
+      </w:pPr>
+      <w:r>
+        <w:rPr>
+          <w:rFonts w:asciiTheme="minorEastAsia" w:hAnsiTheme="minorEastAsia" w:cs="굴림"/>
+          <w:b/>
+          <w:bCs/>
+          <w:kern w:val="0"/>
+          <w:szCs w:val="20"/>
+        </w:rPr>
+        <w:t xml:space="preserve">2) </w:t>
+      </w:r>
+      <w:r>
+        <w:rPr>
+          <w:rFonts w:asciiTheme="minorEastAsia" w:hAnsiTheme="minorEastAsia" w:cs="굴림"/>
+          <w:b/>
+          <w:bCs/>
+          <w:kern w:val="0"/>
+          <w:szCs w:val="20"/>
+        </w:rPr>
+        <w:t>정성 분석 엔진 (AI 애널리스트의 핵심)</w:t>
+      </w:r>
+    </w:p>
+    <w:p>
+      <w:pPr>
+        <w:widowControl/>
+        <w:wordWrap/>
+        <w:autoSpaceDE/>
+        <w:autoSpaceDN/>
+        <w:spacing w:before="100" w:beforeAutospacing="1" w:after="100" w:afterAutospacing="1" w:line="240" w:lineRule="auto"/>
+        <w:ind w:left="720"/>
+        <w:jc w:val="left"/>
+        <w:rPr>
+          <w:rFonts w:asciiTheme="minorEastAsia" w:hAnsiTheme="minorEastAsia" w:cs="굴림"/>
+          <w:kern w:val="0"/>
+          <w:szCs w:val="20"/>
+        </w:rPr>
+      </w:pPr>
+      <w:r>
+        <w:rPr>
+          <w:rFonts w:asciiTheme="minorEastAsia" w:hAnsiTheme="minorEastAsia" w:cs="굴림"/>
+          <w:kern w:val="0"/>
+          <w:szCs w:val="20"/>
+        </w:rPr>
+        <w:t>단순 뉴스 요약이 아닌, 투자 판단에 실질적 도움이 되는 '컨텍스트(맥락) 분석'이 이루어져야 소음(Noise)을 걸러낼 수 있습니다.</w:t>
+      </w:r>
+    </w:p>
+    <w:p>
+      <w:pPr>
+        <w:widowControl/>
+        <w:numPr>
+          <w:ilvl w:val="0"/>
+          <w:numId w:val="3"/>
+        </w:numPr>
+        <w:wordWrap/>
+        <w:autoSpaceDE/>
+        <w:autoSpaceDN/>
+        <w:spacing w:before="100" w:beforeAutospacing="1" w:after="100" w:afterAutospacing="1" w:line="240" w:lineRule="auto"/>
+        <w:jc w:val="left"/>
+        <w:rPr>
+          <w:rFonts w:asciiTheme="minorEastAsia" w:hAnsiTheme="minorEastAsia" w:cs="굴림"/>
+          <w:kern w:val="0"/>
+          <w:szCs w:val="20"/>
+        </w:rPr>
+      </w:pPr>
+      <w:r>
+        <w:rPr>
+          <w:rFonts w:asciiTheme="minorEastAsia" w:hAnsiTheme="minorEastAsia" w:cs="굴림"/>
+          <w:b/>
+          <w:bCs/>
+          <w:kern w:val="0"/>
+          <w:szCs w:val="20"/>
+        </w:rPr>
+        <w:t xml:space="preserve">뉴스 및 리포트 감성/동향 </w:t>
+      </w:r>
+      <w:proofErr w:type="spellStart"/>
+      <w:r>
+        <w:rPr>
+          <w:rFonts w:asciiTheme="minorEastAsia" w:hAnsiTheme="minorEastAsia" w:cs="굴림"/>
+          <w:b/>
+          <w:bCs/>
+          <w:kern w:val="0"/>
+          <w:szCs w:val="20"/>
+        </w:rPr>
+        <w:t>스코어링</w:t>
+      </w:r>
+      <w:proofErr w:type="spellEnd"/>
+      <w:r>
+        <w:rPr>
+          <w:rFonts w:asciiTheme="minorEastAsia" w:hAnsiTheme="minorEastAsia" w:cs="굴림"/>
+          <w:b/>
+          <w:bCs/>
+          <w:kern w:val="0"/>
+          <w:szCs w:val="20"/>
+        </w:rPr>
+        <w:t>:</w:t>
+      </w:r>
+      <w:r>
+        <w:rPr>
+          <w:rFonts w:asciiTheme="minorEastAsia" w:hAnsiTheme="minorEastAsia" w:cs="굴림"/>
+          <w:kern w:val="0"/>
+          <w:szCs w:val="20"/>
+        </w:rPr>
+        <w:t xml:space="preserve"> 실시간 </w:t>
+      </w:r>
+      <w:proofErr w:type="spellStart"/>
+      <w:r>
+        <w:rPr>
+          <w:rFonts w:asciiTheme="minorEastAsia" w:hAnsiTheme="minorEastAsia" w:cs="굴림"/>
+          <w:kern w:val="0"/>
+          <w:szCs w:val="20"/>
+        </w:rPr>
+        <w:t>크롤링된</w:t>
+      </w:r>
+      <w:proofErr w:type="spellEnd"/>
+      <w:r>
+        <w:rPr>
+          <w:rFonts w:asciiTheme="minorEastAsia" w:hAnsiTheme="minorEastAsia" w:cs="굴림"/>
+          <w:kern w:val="0"/>
+          <w:szCs w:val="20"/>
+        </w:rPr>
+        <w:t xml:space="preserve"> 뉴스나 공시 문맥을 분석하여 단순 긍정/부정을 넘어 '실적에 직접적 영향을 주는 요인'인지 판별합니다. (예: "수주 계약 체결" vs "원자재 가격 상승으로 인한 마진 압박")</w:t>
+      </w:r>
+    </w:p>
+    <w:p>
+      <w:pPr>
+        <w:widowControl/>
+        <w:numPr>
+          <w:ilvl w:val="0"/>
+          <w:numId w:val="3"/>
+        </w:numPr>
+        <w:wordWrap/>
+        <w:autoSpaceDE/>
+        <w:autoSpaceDN/>
+        <w:spacing w:before="100" w:beforeAutospacing="1" w:after="100" w:afterAutospacing="1" w:line="240" w:lineRule="auto"/>
+        <w:jc w:val="left"/>
+        <w:rPr>
+          <w:rFonts w:asciiTheme="minorEastAsia" w:hAnsiTheme="minorEastAsia" w:cs="굴림"/>
+          <w:kern w:val="0"/>
+          <w:szCs w:val="20"/>
+        </w:rPr>
+      </w:pPr>
+      <w:r>
+        <w:rPr>
+          <w:rFonts w:asciiTheme="minorEastAsia" w:hAnsiTheme="minorEastAsia" w:cs="굴림"/>
+          <w:b/>
+          <w:bCs/>
+          <w:kern w:val="0"/>
+          <w:szCs w:val="20"/>
+        </w:rPr>
+        <w:t>공시(DART) 행간 분석:</w:t>
+      </w:r>
+      <w:r>
+        <w:rPr>
+          <w:rFonts w:asciiTheme="minorEastAsia" w:hAnsiTheme="minorEastAsia" w:cs="굴림"/>
+          <w:kern w:val="0"/>
+          <w:szCs w:val="20"/>
+        </w:rPr>
+        <w:t xml:space="preserve"> 분기 보고서의 '이사회의 진단 및 분석 의견'이나 '사업의 개요' 텍스트를 AI 에이전트에게 직전 분기 보고서와 비교 분석(</w:t>
+      </w:r>
+      <w:r>
+        <w:rPr>
+          <w:rFonts w:asciiTheme="minorEastAsia" w:hAnsiTheme="minorEastAsia" w:cs="굴림체"/>
+          <w:kern w:val="0"/>
+          <w:szCs w:val="20"/>
+        </w:rPr>
+        <w:t>diff</w:t>
+      </w:r>
+      <w:r>
+        <w:rPr>
+          <w:rFonts w:asciiTheme="minorEastAsia" w:hAnsiTheme="minorEastAsia" w:cs="굴림"/>
+          <w:kern w:val="0"/>
+          <w:szCs w:val="20"/>
+        </w:rPr>
+        <w:t xml:space="preserve">) 시켜, </w:t>
+      </w:r>
+      <w:r>
+        <w:rPr>
+          <w:rFonts w:asciiTheme="minorEastAsia" w:hAnsiTheme="minorEastAsia" w:cs="굴림"/>
+          <w:b/>
+          <w:bCs/>
+          <w:kern w:val="0"/>
+          <w:szCs w:val="20"/>
+        </w:rPr>
+        <w:t xml:space="preserve">회사 측이 </w:t>
+      </w:r>
+      <w:r>
+        <w:rPr>
+          <w:rFonts w:asciiTheme="minorEastAsia" w:hAnsiTheme="minorEastAsia" w:cs="굴림"/>
+          <w:b/>
+          <w:bCs/>
+          <w:kern w:val="0"/>
+          <w:szCs w:val="20"/>
+        </w:rPr>
+        <w:lastRenderedPageBreak/>
+        <w:t>슬그머니 수정한 리스크 문구나 파이프라인 지연 관련 표현</w:t>
+      </w:r>
+      <w:r>
+        <w:rPr>
+          <w:rFonts w:asciiTheme="minorEastAsia" w:hAnsiTheme="minorEastAsia" w:cs="굴림"/>
+          <w:kern w:val="0"/>
+          <w:szCs w:val="20"/>
+        </w:rPr>
+        <w:t xml:space="preserve">이 있는지 잡아내도록 프롬프트를 </w:t>
+      </w:r>
+      <w:proofErr w:type="spellStart"/>
+      <w:r>
+        <w:rPr>
+          <w:rFonts w:asciiTheme="minorEastAsia" w:hAnsiTheme="minorEastAsia" w:cs="굴림"/>
+          <w:kern w:val="0"/>
+          <w:szCs w:val="20"/>
+        </w:rPr>
+        <w:t>고도화합니다</w:t>
+      </w:r>
+      <w:proofErr w:type="spellEnd"/>
+      <w:r>
+        <w:rPr>
+          <w:rFonts w:asciiTheme="minorEastAsia" w:hAnsiTheme="minorEastAsia" w:cs="굴림"/>
+          <w:kern w:val="0"/>
+          <w:szCs w:val="20"/>
+        </w:rPr>
+        <w:t>.</w:t>
+      </w:r>
+    </w:p>
+    <w:p>
+      <w:pPr>
+        <w:widowControl/>
+        <w:wordWrap/>
+        <w:autoSpaceDE/>
+        <w:autoSpaceDN/>
+        <w:spacing w:before="100" w:beforeAutospacing="1" w:after="100" w:afterAutospacing="1" w:line="240" w:lineRule="auto"/>
+        <w:ind w:firstLine="720"/>
+        <w:jc w:val="left"/>
+        <w:outlineLvl w:val="1"/>
+        <w:rPr>
+          <w:rFonts w:asciiTheme="minorEastAsia" w:hAnsiTheme="minorEastAsia" w:cs="굴림"/>
+          <w:b/>
+          <w:bCs/>
+          <w:kern w:val="0"/>
+          <w:szCs w:val="20"/>
+        </w:rPr>
+      </w:pPr>
+      <w:r>
+        <w:rPr>
+          <w:rFonts w:asciiTheme="minorEastAsia" w:hAnsiTheme="minorEastAsia" w:cs="굴림"/>
+          <w:b/>
+          <w:bCs/>
+          <w:kern w:val="0"/>
+          <w:szCs w:val="20"/>
+        </w:rPr>
+        <w:t xml:space="preserve">3) </w:t>
+      </w:r>
+      <w:r>
+        <w:rPr>
+          <w:rFonts w:asciiTheme="minorEastAsia" w:hAnsiTheme="minorEastAsia" w:cs="굴림"/>
+          <w:b/>
+          <w:bCs/>
+          <w:kern w:val="0"/>
+          <w:szCs w:val="20"/>
+        </w:rPr>
+        <w:t>기술적 수급 엔진 (시장 참여자 심리 파악)</w:t>
+      </w:r>
+    </w:p>
+    <w:p>
+      <w:pPr>
+        <w:widowControl/>
+        <w:wordWrap/>
+        <w:autoSpaceDE/>
+        <w:autoSpaceDN/>
+        <w:spacing w:before="100" w:beforeAutospacing="1" w:after="100" w:afterAutospacing="1" w:line="240" w:lineRule="auto"/>
+        <w:ind w:left="720"/>
+        <w:jc w:val="left"/>
+        <w:rPr>
+          <w:rFonts w:asciiTheme="minorEastAsia" w:hAnsiTheme="minorEastAsia" w:cs="굴림"/>
+          <w:kern w:val="0"/>
+          <w:szCs w:val="20"/>
+        </w:rPr>
+      </w:pPr>
+      <w:r>
+        <w:rPr>
+          <w:rFonts w:asciiTheme="minorEastAsia" w:hAnsiTheme="minorEastAsia" w:cs="굴림"/>
+          <w:kern w:val="0"/>
+          <w:szCs w:val="20"/>
+        </w:rPr>
+        <w:t>주가는 결국 수급과 모멘텀에 의해 움직입니다. 에이전트가 매일 장 마감 후 구동될 때 이 부분을 정형 데이터로 산출하게 합니다.</w:t>
+      </w:r>
+    </w:p>
+    <w:p>
+      <w:pPr>
+        <w:widowControl/>
+        <w:numPr>
+          <w:ilvl w:val="0"/>
+          <w:numId w:val="4"/>
+        </w:numPr>
+        <w:wordWrap/>
+        <w:autoSpaceDE/>
+        <w:autoSpaceDN/>
+        <w:spacing w:before="100" w:beforeAutospacing="1" w:after="100" w:afterAutospacing="1" w:line="240" w:lineRule="auto"/>
+        <w:jc w:val="left"/>
+        <w:rPr>
+          <w:rFonts w:asciiTheme="minorEastAsia" w:hAnsiTheme="minorEastAsia" w:cs="굴림"/>
+          <w:kern w:val="0"/>
+          <w:szCs w:val="20"/>
+        </w:rPr>
+      </w:pPr>
+      <w:r>
+        <w:rPr>
+          <w:rFonts w:asciiTheme="minorEastAsia" w:hAnsiTheme="minorEastAsia" w:cs="굴림"/>
+          <w:b/>
+          <w:bCs/>
+          <w:kern w:val="0"/>
+          <w:szCs w:val="20"/>
+        </w:rPr>
+        <w:t>메이저 수급 추적 (주도 세력 분석):</w:t>
+      </w:r>
+      <w:r>
+        <w:rPr>
+          <w:rFonts w:asciiTheme="minorEastAsia" w:hAnsiTheme="minorEastAsia" w:cs="굴림"/>
+          <w:kern w:val="0"/>
+          <w:szCs w:val="20"/>
+        </w:rPr>
+        <w:t xml:space="preserve"> 외국인과 기관의 순매수 대금 추이를 누적으로 추적하고, 특히 특정 업종이나 종목으로의 '수급 쏠림 현상(수급 집중도)'을 </w:t>
+      </w:r>
+      <w:proofErr w:type="spellStart"/>
+      <w:r>
+        <w:rPr>
+          <w:rFonts w:asciiTheme="minorEastAsia" w:hAnsiTheme="minorEastAsia" w:cs="굴림"/>
+          <w:kern w:val="0"/>
+          <w:szCs w:val="20"/>
+        </w:rPr>
+        <w:t>수치화합니다</w:t>
+      </w:r>
+      <w:proofErr w:type="spellEnd"/>
+      <w:r>
+        <w:rPr>
+          <w:rFonts w:asciiTheme="minorEastAsia" w:hAnsiTheme="minorEastAsia" w:cs="굴림"/>
+          <w:kern w:val="0"/>
+          <w:szCs w:val="20"/>
+        </w:rPr>
+        <w:t>.</w:t>
+      </w:r>
+    </w:p>
+    <w:p>
+      <w:pPr>
+        <w:widowControl/>
+        <w:numPr>
+          <w:ilvl w:val="0"/>
+          <w:numId w:val="4"/>
+        </w:numPr>
+        <w:wordWrap/>
+        <w:autoSpaceDE/>
+        <w:autoSpaceDN/>
+        <w:spacing w:before="100" w:beforeAutospacing="1" w:after="100" w:afterAutospacing="1" w:line="240" w:lineRule="auto"/>
+        <w:jc w:val="left"/>
+        <w:rPr>
+          <w:rFonts w:asciiTheme="minorEastAsia" w:hAnsiTheme="minorEastAsia" w:cs="굴림"/>
+          <w:kern w:val="0"/>
+          <w:szCs w:val="20"/>
+        </w:rPr>
+      </w:pPr>
+      <w:r>
+        <w:rPr>
+          <w:rFonts w:asciiTheme="minorEastAsia" w:hAnsiTheme="minorEastAsia" w:cs="굴림"/>
+          <w:b/>
+          <w:bCs/>
+          <w:kern w:val="0"/>
+          <w:szCs w:val="20"/>
+        </w:rPr>
+        <w:t>가격 위치 및 변동성 제어:</w:t>
+      </w:r>
+      <w:r>
+        <w:rPr>
+          <w:rFonts w:asciiTheme="minorEastAsia" w:hAnsiTheme="minorEastAsia" w:cs="굴림"/>
+          <w:kern w:val="0"/>
+          <w:szCs w:val="20"/>
+        </w:rPr>
+        <w:t xml:space="preserve"> 이동평균선 </w:t>
+      </w:r>
+      <w:proofErr w:type="spellStart"/>
+      <w:r>
+        <w:rPr>
+          <w:rFonts w:asciiTheme="minorEastAsia" w:hAnsiTheme="minorEastAsia" w:cs="굴림"/>
+          <w:kern w:val="0"/>
+          <w:szCs w:val="20"/>
+        </w:rPr>
+        <w:t>정배열</w:t>
+      </w:r>
+      <w:proofErr w:type="spellEnd"/>
+      <w:r>
+        <w:rPr>
+          <w:rFonts w:asciiTheme="minorEastAsia" w:hAnsiTheme="minorEastAsia" w:cs="굴림"/>
+          <w:kern w:val="0"/>
+          <w:szCs w:val="20"/>
+        </w:rPr>
+        <w:t xml:space="preserve"> 여부, RSI, </w:t>
+      </w:r>
+      <w:proofErr w:type="spellStart"/>
+      <w:r>
+        <w:rPr>
+          <w:rFonts w:asciiTheme="minorEastAsia" w:hAnsiTheme="minorEastAsia" w:cs="굴림"/>
+          <w:kern w:val="0"/>
+          <w:szCs w:val="20"/>
+        </w:rPr>
+        <w:t>볼린저</w:t>
+      </w:r>
+      <w:proofErr w:type="spellEnd"/>
+      <w:r>
+        <w:rPr>
+          <w:rFonts w:asciiTheme="minorEastAsia" w:hAnsiTheme="minorEastAsia" w:cs="굴림"/>
+          <w:kern w:val="0"/>
+          <w:szCs w:val="20"/>
+        </w:rPr>
+        <w:t xml:space="preserve"> 밴드 등의 지표를 계산하여 현재 주가가 과열 구간인지 혹은 바닥권인지 판별하는 스크립트를 작성하고, AI가 보고서를 쓸 때 이 기술적 위치를 반드시 결합하여 결론을 내리도록 통제합니다.</w:t>
+      </w:r>
+    </w:p>
+    <w:p>
+      <w:pPr>
+        <w:widowControl/>
+        <w:wordWrap/>
+        <w:autoSpaceDE/>
+        <w:autoSpaceDN/>
+        <w:spacing w:before="100" w:beforeAutospacing="1" w:after="100" w:afterAutospacing="1" w:line="240" w:lineRule="auto"/>
+        <w:ind w:firstLine="720"/>
+        <w:jc w:val="left"/>
+        <w:outlineLvl w:val="1"/>
+        <w:rPr>
+          <w:rFonts w:asciiTheme="minorEastAsia" w:hAnsiTheme="minorEastAsia" w:cs="굴림"/>
+          <w:b/>
+          <w:bCs/>
+          <w:kern w:val="0"/>
+          <w:szCs w:val="20"/>
+        </w:rPr>
+      </w:pPr>
+      <w:r>
+        <w:rPr>
+          <w:rFonts w:asciiTheme="minorEastAsia" w:hAnsiTheme="minorEastAsia" w:cs="굴림"/>
+          <w:b/>
+          <w:bCs/>
+          <w:kern w:val="0"/>
+          <w:szCs w:val="20"/>
+        </w:rPr>
+        <w:t xml:space="preserve">4) </w:t>
+      </w:r>
+      <w:r>
+        <w:rPr>
+          <w:rFonts w:asciiTheme="minorEastAsia" w:hAnsiTheme="minorEastAsia" w:cs="굴림"/>
+          <w:b/>
+          <w:bCs/>
+          <w:kern w:val="0"/>
+          <w:szCs w:val="20"/>
+        </w:rPr>
+        <w:t>리스크 관리 및 복기 시스템 (MTS 플랫폼 차별화)</w:t>
+      </w:r>
+    </w:p>
+    <w:p>
+      <w:pPr>
+        <w:widowControl/>
+        <w:wordWrap/>
+        <w:autoSpaceDE/>
+        <w:autoSpaceDN/>
+        <w:spacing w:before="100" w:beforeAutospacing="1" w:after="100" w:afterAutospacing="1" w:line="240" w:lineRule="auto"/>
+        <w:ind w:firstLine="720"/>
+        <w:jc w:val="left"/>
+        <w:rPr>
+          <w:rFonts w:asciiTheme="minorEastAsia" w:hAnsiTheme="minorEastAsia" w:cs="굴림"/>
+          <w:kern w:val="0"/>
+          <w:szCs w:val="20"/>
+        </w:rPr>
+      </w:pPr>
+      <w:r>
+        <w:rPr>
+          <w:rFonts w:asciiTheme="minorEastAsia" w:hAnsiTheme="minorEastAsia" w:cs="굴림"/>
+          <w:kern w:val="0"/>
+          <w:szCs w:val="20"/>
+        </w:rPr>
+        <w:t>실전 투자에서 가장 중요한 것은 '예측'이 아닌 '대응'과 '복기'입니다.</w:t>
+      </w:r>
+    </w:p>
+    <w:p>
+      <w:pPr>
+        <w:widowControl/>
+        <w:numPr>
+          <w:ilvl w:val="0"/>
+          <w:numId w:val="5"/>
+        </w:numPr>
+        <w:wordWrap/>
+        <w:autoSpaceDE/>
+        <w:autoSpaceDN/>
+        <w:spacing w:before="100" w:beforeAutospacing="1" w:after="100" w:afterAutospacing="1" w:line="240" w:lineRule="auto"/>
+        <w:jc w:val="left"/>
+        <w:rPr>
+          <w:rFonts w:asciiTheme="minorEastAsia" w:hAnsiTheme="minorEastAsia" w:cs="굴림"/>
+          <w:kern w:val="0"/>
+          <w:szCs w:val="20"/>
+        </w:rPr>
+      </w:pPr>
+      <w:proofErr w:type="spellStart"/>
+      <w:r>
+        <w:rPr>
+          <w:rFonts w:asciiTheme="minorEastAsia" w:hAnsiTheme="minorEastAsia" w:cs="굴림"/>
+          <w:b/>
+          <w:bCs/>
+          <w:kern w:val="0"/>
+          <w:szCs w:val="20"/>
+        </w:rPr>
+        <w:t>시나리오별</w:t>
+      </w:r>
+      <w:proofErr w:type="spellEnd"/>
+      <w:r>
+        <w:rPr>
+          <w:rFonts w:asciiTheme="minorEastAsia" w:hAnsiTheme="minorEastAsia" w:cs="굴림"/>
+          <w:b/>
+          <w:bCs/>
+          <w:kern w:val="0"/>
+          <w:szCs w:val="20"/>
+        </w:rPr>
+        <w:t xml:space="preserve"> 스트레스 테스트:</w:t>
+      </w:r>
+      <w:r>
+        <w:rPr>
+          <w:rFonts w:asciiTheme="minorEastAsia" w:hAnsiTheme="minorEastAsia" w:cs="굴림"/>
+          <w:kern w:val="0"/>
+          <w:szCs w:val="20"/>
+        </w:rPr>
+        <w:t xml:space="preserve"> 에이전트에게 "만약 환율이 5% 급등하거나, 미 국채 금리가 변동할 경우 현재 포트폴리오(또는 관심 종목)의 예상 이익 변동폭은 어떻게 되는가?"에 대한 가상 시나리오 분석을 정기적으로 수행하게 합니다.</w:t>
+      </w:r>
+    </w:p>
+    <w:p>
+      <w:pPr>
+        <w:widowControl/>
+        <w:numPr>
+          <w:ilvl w:val="0"/>
+          <w:numId w:val="5"/>
+        </w:numPr>
+        <w:wordWrap/>
+        <w:autoSpaceDE/>
+        <w:autoSpaceDN/>
+        <w:spacing w:before="100" w:beforeAutospacing="1" w:after="100" w:afterAutospacing="1" w:line="240" w:lineRule="auto"/>
+        <w:jc w:val="left"/>
+        <w:rPr>
+          <w:rFonts w:asciiTheme="minorEastAsia" w:hAnsiTheme="minorEastAsia" w:cs="굴림"/>
+          <w:kern w:val="0"/>
+          <w:szCs w:val="20"/>
+        </w:rPr>
+      </w:pPr>
+      <w:r>
+        <w:rPr>
+          <w:rFonts w:asciiTheme="minorEastAsia" w:hAnsiTheme="minorEastAsia" w:cs="굴림"/>
+          <w:b/>
+          <w:bCs/>
+          <w:kern w:val="0"/>
+          <w:szCs w:val="20"/>
+        </w:rPr>
+        <w:t>추천 종목 성적표 및 AI 복기:</w:t>
+      </w:r>
+      <w:r>
+        <w:rPr>
+          <w:rFonts w:asciiTheme="minorEastAsia" w:hAnsiTheme="minorEastAsia" w:cs="굴림"/>
+          <w:kern w:val="0"/>
+          <w:szCs w:val="20"/>
+        </w:rPr>
+        <w:t xml:space="preserve"> 에이전트가 유망하다고 판단했던 종목들의 1주일 후, 1개월 후 실제 수익률을 추적하는 성적표 모듈을 연동합니다. 만약 예측이 틀렸다면 </w:t>
+      </w:r>
+      <w:r>
+        <w:rPr>
+          <w:rFonts w:asciiTheme="minorEastAsia" w:hAnsiTheme="minorEastAsia" w:cs="굴림"/>
+          <w:b/>
+          <w:bCs/>
+          <w:kern w:val="0"/>
+          <w:szCs w:val="20"/>
+        </w:rPr>
+        <w:t>"과거 AI가 분석했던 논리와 실제 시장의 흐름 중 어떤 변수(예: 예상치 못한 대외 악재, 수급 이탈 등)에서 괴리가 발생했는지"</w:t>
+      </w:r>
+      <w:r>
+        <w:rPr>
+          <w:rFonts w:asciiTheme="minorEastAsia" w:hAnsiTheme="minorEastAsia" w:cs="굴림"/>
+          <w:kern w:val="0"/>
+          <w:szCs w:val="20"/>
+        </w:rPr>
+        <w:t xml:space="preserve"> 사후 분석 보고서를 자동 생성하여 시스템 스스로 '학습 및 프롬프트 피드백'이 일어나도록 루프를 만듭니다.</w:t>
+      </w:r>
+    </w:p>
+    <w:bookmarkEnd w:id="0"/>
+    <w:p/>
+    <w:p>
+      <w:pPr>
+        <w:pStyle w:val="3"/>
+        <w:ind w:left="1000" w:hanging="400"/>
+      </w:pPr>
+      <w:r>
+        <w:rPr>
+          <w:rFonts w:ascii="맑은 고딕" w:hAnsi="맑은 고딕" w:cs="맑은 고딕"/>
+          <w:highlight w:val="yellow"/>
+        </w:rPr>
+        <w:t>🧠</w:t>
+      </w:r>
+      <w:r>
+        <w:rPr>
+          <w:highlight w:val="yellow"/>
+        </w:rPr>
+        <w:t xml:space="preserve"> AI Studio 연동 시 달라지는 3가지 핵심 변화</w:t>
+      </w:r>
+    </w:p>
+    <w:p>
+      <w:pPr>
+        <w:pStyle w:val="4"/>
+        <w:ind w:left="1200" w:hanging="400"/>
+      </w:pPr>
+      <w:r>
+        <w:t xml:space="preserve">1. 단순 뉴스 나열 </w:t>
+      </w:r>
+      <w:r>
+        <w:rPr>
+          <w:rFonts w:ascii="MS Gothic" w:eastAsia="MS Gothic" w:hAnsi="MS Gothic" w:cs="MS Gothic" w:hint="eastAsia"/>
+        </w:rPr>
+        <w:t>➡</w:t>
+      </w:r>
+      <w:r>
+        <w:t>️ '호재/악재 감성 분석 및 브리핑'</w:t>
+      </w:r>
+    </w:p>
+    <w:p>
+      <w:pPr>
+        <w:pStyle w:val="a4"/>
+        <w:numPr>
+          <w:ilvl w:val="0"/>
+          <w:numId w:val="6"/>
+        </w:numPr>
+      </w:pPr>
+      <w:r>
+        <w:rPr>
+          <w:b/>
+          <w:bCs/>
+        </w:rPr>
+        <w:t>기존:</w:t>
+      </w:r>
+      <w:r>
+        <w:t xml:space="preserve"> 네이버나 구글에서 긁어온 뉴스 헤드라인 5개를 화면에 그대로 보여주는 데 그쳤습니다. 바쁠 때는 기사를 일일이 클릭해서 읽어야 하므로 번거롭습니다.</w:t>
+      </w:r>
+    </w:p>
+    <w:p>
+      <w:pPr>
+        <w:pStyle w:val="a4"/>
+        <w:numPr>
+          <w:ilvl w:val="0"/>
+          <w:numId w:val="6"/>
+        </w:numPr>
+      </w:pPr>
+      <w:r>
+        <w:rPr>
+          <w:b/>
+          <w:bCs/>
+        </w:rPr>
+        <w:t>변경 후:</w:t>
+      </w:r>
+      <w:r>
+        <w:t xml:space="preserve"> AI가 실시간 뉴스 5개의 본문과 제목을 순식간에 </w:t>
+      </w:r>
+      <w:proofErr w:type="spellStart"/>
+      <w:r>
+        <w:t>읽어내려간</w:t>
+      </w:r>
+      <w:proofErr w:type="spellEnd"/>
+      <w:r>
+        <w:t xml:space="preserve"> 뒤, "이 뉴스는 이 기업에 70% 확률로 호재입니다. 특히 신제품 수출 계약 건이 향후 실적에 긍정적인 영향을 미칠 것으로 분석됩니다."와 같이 요약 및 감성 분석(Sentiment Analysis) 보고서를 단 세 줄로 요약해 줍니다.</w:t>
+      </w:r>
+    </w:p>
+    <w:p>
+      <w:pPr>
+        <w:pStyle w:val="4"/>
+        <w:ind w:left="1200" w:hanging="400"/>
+      </w:pPr>
+      <w:r>
+        <w:lastRenderedPageBreak/>
+        <w:t xml:space="preserve">2. 딱딱한 수치 </w:t>
+      </w:r>
+      <w:r>
+        <w:rPr>
+          <w:rFonts w:ascii="MS Gothic" w:eastAsia="MS Gothic" w:hAnsi="MS Gothic" w:cs="MS Gothic" w:hint="eastAsia"/>
+        </w:rPr>
+        <w:t>➡</w:t>
+      </w:r>
+      <w:r>
+        <w:t>️ '종합적인 투자 매력도 가이드'</w:t>
+      </w:r>
+    </w:p>
+    <w:p>
+      <w:pPr>
+        <w:pStyle w:val="a4"/>
+        <w:numPr>
+          <w:ilvl w:val="0"/>
+          <w:numId w:val="7"/>
+        </w:numPr>
+      </w:pPr>
+      <w:r>
+        <w:rPr>
+          <w:b/>
+          <w:bCs/>
+        </w:rPr>
+        <w:t>기존:</w:t>
+      </w:r>
+      <w:r>
+        <w:t xml:space="preserve"> RSI가 얼마인지, MACD가 </w:t>
+      </w:r>
+      <w:proofErr w:type="spellStart"/>
+      <w:r>
+        <w:t>골든크로스인지</w:t>
+      </w:r>
+      <w:proofErr w:type="spellEnd"/>
+      <w:r>
+        <w:t xml:space="preserve"> 투자자가 숫자를 보고 직접 머리를 싸매며 판단해야 했습니다.</w:t>
+      </w:r>
+    </w:p>
+    <w:p>
+      <w:pPr>
+        <w:pStyle w:val="a4"/>
+        <w:numPr>
+          <w:ilvl w:val="0"/>
+          <w:numId w:val="7"/>
+        </w:numPr>
+      </w:pPr>
+      <w:r>
+        <w:rPr>
+          <w:b/>
+          <w:bCs/>
+        </w:rPr>
+        <w:t>변경 후:</w:t>
+      </w:r>
+      <w:r>
+        <w:t xml:space="preserve"> AI Studio에 "RSI는 40이고, 외인은 7일 연속 매수 중이며, 오늘 뉴스는 호재가 많아"</w:t>
+      </w:r>
+      <w:proofErr w:type="spellStart"/>
+      <w:r>
+        <w:t>라고</w:t>
+      </w:r>
+      <w:proofErr w:type="spellEnd"/>
+      <w:r>
+        <w:t xml:space="preserve"> 모든 데이터를 싹 모아서 던져주면, AI가 수급, 기술적 지표, 뉴스를 종합적으로 판단하여 "현재 이 종목은 단기 </w:t>
+      </w:r>
+      <w:proofErr w:type="spellStart"/>
+      <w:r>
+        <w:t>과매도</w:t>
+      </w:r>
+      <w:proofErr w:type="spellEnd"/>
+      <w:r>
+        <w:t xml:space="preserve"> 구간에서 외인 수급이 받쳐주는 '매수 유망' 상태입니다"</w:t>
+      </w:r>
+      <w:proofErr w:type="spellStart"/>
+      <w:r>
+        <w:t>라고</w:t>
+      </w:r>
+      <w:proofErr w:type="spellEnd"/>
+      <w:r>
+        <w:t xml:space="preserve"> 인간 전문가처럼 결론을 내려줍니다.</w:t>
+      </w:r>
+    </w:p>
+    <w:p>
+      <w:pPr>
+        <w:pStyle w:val="4"/>
+        <w:ind w:left="1200" w:hanging="400"/>
+      </w:pPr>
+      <w:r>
+        <w:t xml:space="preserve">3. 고정된 메뉴 </w:t>
+      </w:r>
+      <w:r>
+        <w:rPr>
+          <w:rFonts w:ascii="MS Gothic" w:eastAsia="MS Gothic" w:hAnsi="MS Gothic" w:cs="MS Gothic" w:hint="eastAsia"/>
+        </w:rPr>
+        <w:t>➡</w:t>
+      </w:r>
+      <w:r>
+        <w:t xml:space="preserve">️ '무엇이든 물어보는 AI </w:t>
+      </w:r>
+      <w:proofErr w:type="spellStart"/>
+      <w:r>
+        <w:t>챗봇</w:t>
+      </w:r>
+      <w:proofErr w:type="spellEnd"/>
+      <w:r>
+        <w:t xml:space="preserve"> 탑재'</w:t>
+      </w:r>
+    </w:p>
+    <w:p>
+      <w:pPr>
+        <w:pStyle w:val="a4"/>
+        <w:numPr>
+          <w:ilvl w:val="0"/>
+          <w:numId w:val="8"/>
+        </w:numPr>
+      </w:pPr>
+      <w:r>
+        <w:rPr>
+          <w:b/>
+          <w:bCs/>
+        </w:rPr>
+        <w:t>기존:</w:t>
+      </w:r>
+      <w:r>
+        <w:t xml:space="preserve"> 대시보드에 미리 만들어둔 기능(수급, 뉴스)만 수동적으로 조회할 수 있었습니다.</w:t>
+      </w:r>
+    </w:p>
+    <w:p>
+      <w:pPr>
+        <w:pStyle w:val="a4"/>
+        <w:numPr>
+          <w:ilvl w:val="0"/>
+          <w:numId w:val="8"/>
+        </w:numPr>
+      </w:pPr>
+      <w:r>
+        <w:rPr>
+          <w:b/>
+          <w:bCs/>
+        </w:rPr>
+        <w:t>변경 후:</w:t>
+      </w:r>
+      <w:r>
+        <w:t xml:space="preserve"> 대시보드 하단에 </w:t>
+      </w:r>
+      <w:proofErr w:type="spellStart"/>
+      <w:r>
+        <w:t>대화창을</w:t>
+      </w:r>
+      <w:proofErr w:type="spellEnd"/>
+      <w:r>
+        <w:t xml:space="preserve"> 하나 만들어서 "삼성전자 지금 들어가도 괜찮을까?</w:t>
+      </w:r>
+      <w:proofErr w:type="gramStart"/>
+      <w:r>
+        <w:t>",</w:t>
+      </w:r>
+      <w:proofErr w:type="gramEnd"/>
+      <w:r>
+        <w:t xml:space="preserve"> "주말 사이에 반도체 업계에 중요한 이슈 있었어?"라고 사람에게 말하듯 편하게 물어보고, 실시간 데이터에 기반한 답변을 즉시 받아볼 수 있습니다.</w:t>
+      </w:r>
+    </w:p>
+    <w:p/>
     <w:p/>
     <w:sectPr>
       <w:pgSz w:w="11906" w:h="16838"/>
@@ -735,6 +2509,453 @@
 <file path=word/numbering.xml><?xml version="1.0" encoding="utf-8"?>
 <w:numbering xmlns:wpc="http://schemas.microsoft.com/office/word/2010/wordprocessingCanvas" xmlns:cx="http://schemas.microsoft.com/office/drawing/2014/chartex" xmlns:cx1="http://schemas.microsoft.com/office/drawing/2015/9/8/chartex" xmlns:mc="http://schemas.openxmlformats.org/markup-compatibility/2006" xmlns:o="urn:schemas-microsoft-com:office:office" xmlns:r="http://schemas.openxmlformats.org/officeDocument/2006/relationships" xmlns:m="http://schemas.openxmlformats.org/officeDocument/2006/math" xmlns:v="urn:schemas-microsoft-com:vml" xmlns:wp14="http://schemas.microsoft.com/office/word/2010/wordprocessingDrawing" xmlns:wp="http://schemas.openxmlformats.org/drawingml/2006/wordprocessingDrawing" xmlns:w10="urn:schemas-microsoft-com:office:word" xmlns:w="http://schemas.openxmlformats.org/wordprocessingml/2006/main" xmlns:w14="http://schemas.microsoft.com/office/word/2010/wordml" xmlns:w15="http://schemas.microsoft.com/office/word/2012/wordml" xmlns:w16se="http://schemas.microsoft.com/office/word/2015/wordml/symex" xmlns:wpg="http://schemas.microsoft.com/office/word/2010/wordprocessingGroup" xmlns:wpi="http://schemas.microsoft.com/office/word/2010/wordprocessingInk" xmlns:wne="http://schemas.microsoft.com/office/word/2006/wordml" xmlns:wps="http://schemas.microsoft.com/office/word/2010/wordprocessingShape" mc:Ignorable="w14 w15 w16se wp14">
   <w:abstractNum w:abstractNumId="0" w15:restartNumberingAfterBreak="0">
+    <w:nsid w:val="0E297903"/>
+    <w:multiLevelType w:val="multilevel"/>
+    <w:tmpl w:val="92EE3298"/>
+    <w:lvl w:ilvl="0">
+      <w:start w:val="1"/>
+      <w:numFmt w:val="bullet"/>
+      <w:lvlText w:val=""/>
+      <w:lvlJc w:val="left"/>
+      <w:pPr>
+        <w:tabs>
+          <w:tab w:val="num" w:pos="720"/>
+        </w:tabs>
+        <w:ind w:left="720" w:hanging="360"/>
+      </w:pPr>
+      <w:rPr>
+        <w:rFonts w:ascii="Symbol" w:hAnsi="Symbol" w:hint="default"/>
+        <w:sz w:val="20"/>
+      </w:rPr>
+    </w:lvl>
+    <w:lvl w:ilvl="1" w:tentative="1">
+      <w:start w:val="1"/>
+      <w:numFmt w:val="bullet"/>
+      <w:lvlText w:val="o"/>
+      <w:lvlJc w:val="left"/>
+      <w:pPr>
+        <w:tabs>
+          <w:tab w:val="num" w:pos="1440"/>
+        </w:tabs>
+        <w:ind w:left="1440" w:hanging="360"/>
+      </w:pPr>
+      <w:rPr>
+        <w:rFonts w:ascii="Courier New" w:hAnsi="Courier New" w:hint="default"/>
+        <w:sz w:val="20"/>
+      </w:rPr>
+    </w:lvl>
+    <w:lvl w:ilvl="2" w:tentative="1">
+      <w:start w:val="1"/>
+      <w:numFmt w:val="bullet"/>
+      <w:lvlText w:val=""/>
+      <w:lvlJc w:val="left"/>
+      <w:pPr>
+        <w:tabs>
+          <w:tab w:val="num" w:pos="2160"/>
+        </w:tabs>
+        <w:ind w:left="2160" w:hanging="360"/>
+      </w:pPr>
+      <w:rPr>
+        <w:rFonts w:ascii="Wingdings" w:hAnsi="Wingdings" w:hint="default"/>
+        <w:sz w:val="20"/>
+      </w:rPr>
+    </w:lvl>
+    <w:lvl w:ilvl="3" w:tentative="1">
+      <w:start w:val="1"/>
+      <w:numFmt w:val="bullet"/>
+      <w:lvlText w:val=""/>
+      <w:lvlJc w:val="left"/>
+      <w:pPr>
+        <w:tabs>
+          <w:tab w:val="num" w:pos="2880"/>
+        </w:tabs>
+        <w:ind w:left="2880" w:hanging="360"/>
+      </w:pPr>
+      <w:rPr>
+        <w:rFonts w:ascii="Wingdings" w:hAnsi="Wingdings" w:hint="default"/>
+        <w:sz w:val="20"/>
+      </w:rPr>
+    </w:lvl>
+    <w:lvl w:ilvl="4" w:tentative="1">
+      <w:start w:val="1"/>
+      <w:numFmt w:val="bullet"/>
+      <w:lvlText w:val=""/>
+      <w:lvlJc w:val="left"/>
+      <w:pPr>
+        <w:tabs>
+          <w:tab w:val="num" w:pos="3600"/>
+        </w:tabs>
+        <w:ind w:left="3600" w:hanging="360"/>
+      </w:pPr>
+      <w:rPr>
+        <w:rFonts w:ascii="Wingdings" w:hAnsi="Wingdings" w:hint="default"/>
+        <w:sz w:val="20"/>
+      </w:rPr>
+    </w:lvl>
+    <w:lvl w:ilvl="5" w:tentative="1">
+      <w:start w:val="1"/>
+      <w:numFmt w:val="bullet"/>
+      <w:lvlText w:val=""/>
+      <w:lvlJc w:val="left"/>
+      <w:pPr>
+        <w:tabs>
+          <w:tab w:val="num" w:pos="4320"/>
+        </w:tabs>
+        <w:ind w:left="4320" w:hanging="360"/>
+      </w:pPr>
+      <w:rPr>
+        <w:rFonts w:ascii="Wingdings" w:hAnsi="Wingdings" w:hint="default"/>
+        <w:sz w:val="20"/>
+      </w:rPr>
+    </w:lvl>
+    <w:lvl w:ilvl="6" w:tentative="1">
+      <w:start w:val="1"/>
+      <w:numFmt w:val="bullet"/>
+      <w:lvlText w:val=""/>
+      <w:lvlJc w:val="left"/>
+      <w:pPr>
+        <w:tabs>
+          <w:tab w:val="num" w:pos="5040"/>
+        </w:tabs>
+        <w:ind w:left="5040" w:hanging="360"/>
+      </w:pPr>
+      <w:rPr>
+        <w:rFonts w:ascii="Wingdings" w:hAnsi="Wingdings" w:hint="default"/>
+        <w:sz w:val="20"/>
+      </w:rPr>
+    </w:lvl>
+    <w:lvl w:ilvl="7" w:tentative="1">
+      <w:start w:val="1"/>
+      <w:numFmt w:val="bullet"/>
+      <w:lvlText w:val=""/>
+      <w:lvlJc w:val="left"/>
+      <w:pPr>
+        <w:tabs>
+          <w:tab w:val="num" w:pos="5760"/>
+        </w:tabs>
+        <w:ind w:left="5760" w:hanging="360"/>
+      </w:pPr>
+      <w:rPr>
+        <w:rFonts w:ascii="Wingdings" w:hAnsi="Wingdings" w:hint="default"/>
+        <w:sz w:val="20"/>
+      </w:rPr>
+    </w:lvl>
+    <w:lvl w:ilvl="8" w:tentative="1">
+      <w:start w:val="1"/>
+      <w:numFmt w:val="bullet"/>
+      <w:lvlText w:val=""/>
+      <w:lvlJc w:val="left"/>
+      <w:pPr>
+        <w:tabs>
+          <w:tab w:val="num" w:pos="6480"/>
+        </w:tabs>
+        <w:ind w:left="6480" w:hanging="360"/>
+      </w:pPr>
+      <w:rPr>
+        <w:rFonts w:ascii="Wingdings" w:hAnsi="Wingdings" w:hint="default"/>
+        <w:sz w:val="20"/>
+      </w:rPr>
+    </w:lvl>
+  </w:abstractNum>
+  <w:abstractNum w:abstractNumId="1" w15:restartNumberingAfterBreak="0">
+    <w:nsid w:val="2F4F3426"/>
+    <w:multiLevelType w:val="multilevel"/>
+    <w:tmpl w:val="A9D01E04"/>
+    <w:lvl w:ilvl="0">
+      <w:start w:val="1"/>
+      <w:numFmt w:val="bullet"/>
+      <w:lvlText w:val=""/>
+      <w:lvlJc w:val="left"/>
+      <w:pPr>
+        <w:tabs>
+          <w:tab w:val="num" w:pos="1080"/>
+        </w:tabs>
+        <w:ind w:left="1080" w:hanging="360"/>
+      </w:pPr>
+      <w:rPr>
+        <w:rFonts w:ascii="Symbol" w:hAnsi="Symbol" w:hint="default"/>
+        <w:sz w:val="20"/>
+      </w:rPr>
+    </w:lvl>
+    <w:lvl w:ilvl="1" w:tentative="1">
+      <w:start w:val="1"/>
+      <w:numFmt w:val="bullet"/>
+      <w:lvlText w:val="o"/>
+      <w:lvlJc w:val="left"/>
+      <w:pPr>
+        <w:tabs>
+          <w:tab w:val="num" w:pos="1800"/>
+        </w:tabs>
+        <w:ind w:left="1800" w:hanging="360"/>
+      </w:pPr>
+      <w:rPr>
+        <w:rFonts w:ascii="Courier New" w:hAnsi="Courier New" w:hint="default"/>
+        <w:sz w:val="20"/>
+      </w:rPr>
+    </w:lvl>
+    <w:lvl w:ilvl="2" w:tentative="1">
+      <w:start w:val="1"/>
+      <w:numFmt w:val="bullet"/>
+      <w:lvlText w:val=""/>
+      <w:lvlJc w:val="left"/>
+      <w:pPr>
+        <w:tabs>
+          <w:tab w:val="num" w:pos="2520"/>
+        </w:tabs>
+        <w:ind w:left="2520" w:hanging="360"/>
+      </w:pPr>
+      <w:rPr>
+        <w:rFonts w:ascii="Wingdings" w:hAnsi="Wingdings" w:hint="default"/>
+        <w:sz w:val="20"/>
+      </w:rPr>
+    </w:lvl>
+    <w:lvl w:ilvl="3" w:tentative="1">
+      <w:start w:val="1"/>
+      <w:numFmt w:val="bullet"/>
+      <w:lvlText w:val=""/>
+      <w:lvlJc w:val="left"/>
+      <w:pPr>
+        <w:tabs>
+          <w:tab w:val="num" w:pos="3240"/>
+        </w:tabs>
+        <w:ind w:left="3240" w:hanging="360"/>
+      </w:pPr>
+      <w:rPr>
+        <w:rFonts w:ascii="Wingdings" w:hAnsi="Wingdings" w:hint="default"/>
+        <w:sz w:val="20"/>
+      </w:rPr>
+    </w:lvl>
+    <w:lvl w:ilvl="4" w:tentative="1">
+      <w:start w:val="1"/>
+      <w:numFmt w:val="bullet"/>
+      <w:lvlText w:val=""/>
+      <w:lvlJc w:val="left"/>
+      <w:pPr>
+        <w:tabs>
+          <w:tab w:val="num" w:pos="3960"/>
+        </w:tabs>
+        <w:ind w:left="3960" w:hanging="360"/>
+      </w:pPr>
+      <w:rPr>
+        <w:rFonts w:ascii="Wingdings" w:hAnsi="Wingdings" w:hint="default"/>
+        <w:sz w:val="20"/>
+      </w:rPr>
+    </w:lvl>
+    <w:lvl w:ilvl="5" w:tentative="1">
+      <w:start w:val="1"/>
+      <w:numFmt w:val="bullet"/>
+      <w:lvlText w:val=""/>
+      <w:lvlJc w:val="left"/>
+      <w:pPr>
+        <w:tabs>
+          <w:tab w:val="num" w:pos="4680"/>
+        </w:tabs>
+        <w:ind w:left="4680" w:hanging="360"/>
+      </w:pPr>
+      <w:rPr>
+        <w:rFonts w:ascii="Wingdings" w:hAnsi="Wingdings" w:hint="default"/>
+        <w:sz w:val="20"/>
+      </w:rPr>
+    </w:lvl>
+    <w:lvl w:ilvl="6" w:tentative="1">
+      <w:start w:val="1"/>
+      <w:numFmt w:val="bullet"/>
+      <w:lvlText w:val=""/>
+      <w:lvlJc w:val="left"/>
+      <w:pPr>
+        <w:tabs>
+          <w:tab w:val="num" w:pos="5400"/>
+        </w:tabs>
+        <w:ind w:left="5400" w:hanging="360"/>
+      </w:pPr>
+      <w:rPr>
+        <w:rFonts w:ascii="Wingdings" w:hAnsi="Wingdings" w:hint="default"/>
+        <w:sz w:val="20"/>
+      </w:rPr>
+    </w:lvl>
+    <w:lvl w:ilvl="7" w:tentative="1">
+      <w:start w:val="1"/>
+      <w:numFmt w:val="bullet"/>
+      <w:lvlText w:val=""/>
+      <w:lvlJc w:val="left"/>
+      <w:pPr>
+        <w:tabs>
+          <w:tab w:val="num" w:pos="6120"/>
+        </w:tabs>
+        <w:ind w:left="6120" w:hanging="360"/>
+      </w:pPr>
+      <w:rPr>
+        <w:rFonts w:ascii="Wingdings" w:hAnsi="Wingdings" w:hint="default"/>
+        <w:sz w:val="20"/>
+      </w:rPr>
+    </w:lvl>
+    <w:lvl w:ilvl="8" w:tentative="1">
+      <w:start w:val="1"/>
+      <w:numFmt w:val="bullet"/>
+      <w:lvlText w:val=""/>
+      <w:lvlJc w:val="left"/>
+      <w:pPr>
+        <w:tabs>
+          <w:tab w:val="num" w:pos="6840"/>
+        </w:tabs>
+        <w:ind w:left="6840" w:hanging="360"/>
+      </w:pPr>
+      <w:rPr>
+        <w:rFonts w:ascii="Wingdings" w:hAnsi="Wingdings" w:hint="default"/>
+        <w:sz w:val="20"/>
+      </w:rPr>
+    </w:lvl>
+  </w:abstractNum>
+  <w:abstractNum w:abstractNumId="2" w15:restartNumberingAfterBreak="0">
+    <w:nsid w:val="498D57B2"/>
+    <w:multiLevelType w:val="multilevel"/>
+    <w:tmpl w:val="05722C9A"/>
+    <w:lvl w:ilvl="0">
+      <w:start w:val="1"/>
+      <w:numFmt w:val="bullet"/>
+      <w:lvlText w:val=""/>
+      <w:lvlJc w:val="left"/>
+      <w:pPr>
+        <w:tabs>
+          <w:tab w:val="num" w:pos="1080"/>
+        </w:tabs>
+        <w:ind w:left="1080" w:hanging="360"/>
+      </w:pPr>
+      <w:rPr>
+        <w:rFonts w:ascii="Symbol" w:hAnsi="Symbol" w:hint="default"/>
+        <w:sz w:val="20"/>
+      </w:rPr>
+    </w:lvl>
+    <w:lvl w:ilvl="1" w:tentative="1">
+      <w:start w:val="1"/>
+      <w:numFmt w:val="bullet"/>
+      <w:lvlText w:val="o"/>
+      <w:lvlJc w:val="left"/>
+      <w:pPr>
+        <w:tabs>
+          <w:tab w:val="num" w:pos="1800"/>
+        </w:tabs>
+        <w:ind w:left="1800" w:hanging="360"/>
+      </w:pPr>
+      <w:rPr>
+        <w:rFonts w:ascii="Courier New" w:hAnsi="Courier New" w:hint="default"/>
+        <w:sz w:val="20"/>
+      </w:rPr>
+    </w:lvl>
+    <w:lvl w:ilvl="2" w:tentative="1">
+      <w:start w:val="1"/>
+      <w:numFmt w:val="bullet"/>
+      <w:lvlText w:val=""/>
+      <w:lvlJc w:val="left"/>
+      <w:pPr>
+        <w:tabs>
+          <w:tab w:val="num" w:pos="2520"/>
+        </w:tabs>
+        <w:ind w:left="2520" w:hanging="360"/>
+      </w:pPr>
+      <w:rPr>
+        <w:rFonts w:ascii="Wingdings" w:hAnsi="Wingdings" w:hint="default"/>
+        <w:sz w:val="20"/>
+      </w:rPr>
+    </w:lvl>
+    <w:lvl w:ilvl="3" w:tentative="1">
+      <w:start w:val="1"/>
+      <w:numFmt w:val="bullet"/>
+      <w:lvlText w:val=""/>
+      <w:lvlJc w:val="left"/>
+      <w:pPr>
+        <w:tabs>
+          <w:tab w:val="num" w:pos="3240"/>
+        </w:tabs>
+        <w:ind w:left="3240" w:hanging="360"/>
+      </w:pPr>
+      <w:rPr>
+        <w:rFonts w:ascii="Wingdings" w:hAnsi="Wingdings" w:hint="default"/>
+        <w:sz w:val="20"/>
+      </w:rPr>
+    </w:lvl>
+    <w:lvl w:ilvl="4" w:tentative="1">
+      <w:start w:val="1"/>
+      <w:numFmt w:val="bullet"/>
+      <w:lvlText w:val=""/>
+      <w:lvlJc w:val="left"/>
+      <w:pPr>
+        <w:tabs>
+          <w:tab w:val="num" w:pos="3960"/>
+        </w:tabs>
+        <w:ind w:left="3960" w:hanging="360"/>
+      </w:pPr>
+      <w:rPr>
+        <w:rFonts w:ascii="Wingdings" w:hAnsi="Wingdings" w:hint="default"/>
+        <w:sz w:val="20"/>
+      </w:rPr>
+    </w:lvl>
+    <w:lvl w:ilvl="5" w:tentative="1">
+      <w:start w:val="1"/>
+      <w:numFmt w:val="bullet"/>
+      <w:lvlText w:val=""/>
+      <w:lvlJc w:val="left"/>
+      <w:pPr>
+        <w:tabs>
+          <w:tab w:val="num" w:pos="4680"/>
+        </w:tabs>
+        <w:ind w:left="4680" w:hanging="360"/>
+      </w:pPr>
+      <w:rPr>
+        <w:rFonts w:ascii="Wingdings" w:hAnsi="Wingdings" w:hint="default"/>
+        <w:sz w:val="20"/>
+      </w:rPr>
+    </w:lvl>
+    <w:lvl w:ilvl="6" w:tentative="1">
+      <w:start w:val="1"/>
+      <w:numFmt w:val="bullet"/>
+      <w:lvlText w:val=""/>
+      <w:lvlJc w:val="left"/>
+      <w:pPr>
+        <w:tabs>
+          <w:tab w:val="num" w:pos="5400"/>
+        </w:tabs>
+        <w:ind w:left="5400" w:hanging="360"/>
+      </w:pPr>
+      <w:rPr>
+        <w:rFonts w:ascii="Wingdings" w:hAnsi="Wingdings" w:hint="default"/>
+        <w:sz w:val="20"/>
+      </w:rPr>
+    </w:lvl>
+    <w:lvl w:ilvl="7" w:tentative="1">
+      <w:start w:val="1"/>
+      <w:numFmt w:val="bullet"/>
+      <w:lvlText w:val=""/>
+      <w:lvlJc w:val="left"/>
+      <w:pPr>
+        <w:tabs>
+          <w:tab w:val="num" w:pos="6120"/>
+        </w:tabs>
+        <w:ind w:left="6120" w:hanging="360"/>
+      </w:pPr>
+      <w:rPr>
+        <w:rFonts w:ascii="Wingdings" w:hAnsi="Wingdings" w:hint="default"/>
+        <w:sz w:val="20"/>
+      </w:rPr>
+    </w:lvl>
+    <w:lvl w:ilvl="8" w:tentative="1">
+      <w:start w:val="1"/>
+      <w:numFmt w:val="bullet"/>
+      <w:lvlText w:val=""/>
+      <w:lvlJc w:val="left"/>
+      <w:pPr>
+        <w:tabs>
+          <w:tab w:val="num" w:pos="6840"/>
+        </w:tabs>
+        <w:ind w:left="6840" w:hanging="360"/>
+      </w:pPr>
+      <w:rPr>
+        <w:rFonts w:ascii="Wingdings" w:hAnsi="Wingdings" w:hint="default"/>
+        <w:sz w:val="20"/>
+      </w:rPr>
+    </w:lvl>
+  </w:abstractNum>
+  <w:abstractNum w:abstractNumId="3" w15:restartNumberingAfterBreak="0">
     <w:nsid w:val="4CBE68AB"/>
     <w:multiLevelType w:val="hybridMultilevel"/>
     <w:tmpl w:val="0CA6A534"/>
@@ -823,7 +3044,624 @@
       </w:pPr>
     </w:lvl>
   </w:abstractNum>
+  <w:abstractNum w:abstractNumId="4" w15:restartNumberingAfterBreak="0">
+    <w:nsid w:val="56222AB2"/>
+    <w:multiLevelType w:val="multilevel"/>
+    <w:tmpl w:val="362CB1BC"/>
+    <w:lvl w:ilvl="0">
+      <w:start w:val="1"/>
+      <w:numFmt w:val="bullet"/>
+      <w:lvlText w:val=""/>
+      <w:lvlJc w:val="left"/>
+      <w:pPr>
+        <w:tabs>
+          <w:tab w:val="num" w:pos="720"/>
+        </w:tabs>
+        <w:ind w:left="720" w:hanging="360"/>
+      </w:pPr>
+      <w:rPr>
+        <w:rFonts w:ascii="Symbol" w:hAnsi="Symbol" w:hint="default"/>
+        <w:sz w:val="20"/>
+      </w:rPr>
+    </w:lvl>
+    <w:lvl w:ilvl="1" w:tentative="1">
+      <w:start w:val="1"/>
+      <w:numFmt w:val="bullet"/>
+      <w:lvlText w:val="o"/>
+      <w:lvlJc w:val="left"/>
+      <w:pPr>
+        <w:tabs>
+          <w:tab w:val="num" w:pos="1440"/>
+        </w:tabs>
+        <w:ind w:left="1440" w:hanging="360"/>
+      </w:pPr>
+      <w:rPr>
+        <w:rFonts w:ascii="Courier New" w:hAnsi="Courier New" w:hint="default"/>
+        <w:sz w:val="20"/>
+      </w:rPr>
+    </w:lvl>
+    <w:lvl w:ilvl="2" w:tentative="1">
+      <w:start w:val="1"/>
+      <w:numFmt w:val="bullet"/>
+      <w:lvlText w:val=""/>
+      <w:lvlJc w:val="left"/>
+      <w:pPr>
+        <w:tabs>
+          <w:tab w:val="num" w:pos="2160"/>
+        </w:tabs>
+        <w:ind w:left="2160" w:hanging="360"/>
+      </w:pPr>
+      <w:rPr>
+        <w:rFonts w:ascii="Wingdings" w:hAnsi="Wingdings" w:hint="default"/>
+        <w:sz w:val="20"/>
+      </w:rPr>
+    </w:lvl>
+    <w:lvl w:ilvl="3" w:tentative="1">
+      <w:start w:val="1"/>
+      <w:numFmt w:val="bullet"/>
+      <w:lvlText w:val=""/>
+      <w:lvlJc w:val="left"/>
+      <w:pPr>
+        <w:tabs>
+          <w:tab w:val="num" w:pos="2880"/>
+        </w:tabs>
+        <w:ind w:left="2880" w:hanging="360"/>
+      </w:pPr>
+      <w:rPr>
+        <w:rFonts w:ascii="Wingdings" w:hAnsi="Wingdings" w:hint="default"/>
+        <w:sz w:val="20"/>
+      </w:rPr>
+    </w:lvl>
+    <w:lvl w:ilvl="4" w:tentative="1">
+      <w:start w:val="1"/>
+      <w:numFmt w:val="bullet"/>
+      <w:lvlText w:val=""/>
+      <w:lvlJc w:val="left"/>
+      <w:pPr>
+        <w:tabs>
+          <w:tab w:val="num" w:pos="3600"/>
+        </w:tabs>
+        <w:ind w:left="3600" w:hanging="360"/>
+      </w:pPr>
+      <w:rPr>
+        <w:rFonts w:ascii="Wingdings" w:hAnsi="Wingdings" w:hint="default"/>
+        <w:sz w:val="20"/>
+      </w:rPr>
+    </w:lvl>
+    <w:lvl w:ilvl="5" w:tentative="1">
+      <w:start w:val="1"/>
+      <w:numFmt w:val="bullet"/>
+      <w:lvlText w:val=""/>
+      <w:lvlJc w:val="left"/>
+      <w:pPr>
+        <w:tabs>
+          <w:tab w:val="num" w:pos="4320"/>
+        </w:tabs>
+        <w:ind w:left="4320" w:hanging="360"/>
+      </w:pPr>
+      <w:rPr>
+        <w:rFonts w:ascii="Wingdings" w:hAnsi="Wingdings" w:hint="default"/>
+        <w:sz w:val="20"/>
+      </w:rPr>
+    </w:lvl>
+    <w:lvl w:ilvl="6" w:tentative="1">
+      <w:start w:val="1"/>
+      <w:numFmt w:val="bullet"/>
+      <w:lvlText w:val=""/>
+      <w:lvlJc w:val="left"/>
+      <w:pPr>
+        <w:tabs>
+          <w:tab w:val="num" w:pos="5040"/>
+        </w:tabs>
+        <w:ind w:left="5040" w:hanging="360"/>
+      </w:pPr>
+      <w:rPr>
+        <w:rFonts w:ascii="Wingdings" w:hAnsi="Wingdings" w:hint="default"/>
+        <w:sz w:val="20"/>
+      </w:rPr>
+    </w:lvl>
+    <w:lvl w:ilvl="7" w:tentative="1">
+      <w:start w:val="1"/>
+      <w:numFmt w:val="bullet"/>
+      <w:lvlText w:val=""/>
+      <w:lvlJc w:val="left"/>
+      <w:pPr>
+        <w:tabs>
+          <w:tab w:val="num" w:pos="5760"/>
+        </w:tabs>
+        <w:ind w:left="5760" w:hanging="360"/>
+      </w:pPr>
+      <w:rPr>
+        <w:rFonts w:ascii="Wingdings" w:hAnsi="Wingdings" w:hint="default"/>
+        <w:sz w:val="20"/>
+      </w:rPr>
+    </w:lvl>
+    <w:lvl w:ilvl="8" w:tentative="1">
+      <w:start w:val="1"/>
+      <w:numFmt w:val="bullet"/>
+      <w:lvlText w:val=""/>
+      <w:lvlJc w:val="left"/>
+      <w:pPr>
+        <w:tabs>
+          <w:tab w:val="num" w:pos="6480"/>
+        </w:tabs>
+        <w:ind w:left="6480" w:hanging="360"/>
+      </w:pPr>
+      <w:rPr>
+        <w:rFonts w:ascii="Wingdings" w:hAnsi="Wingdings" w:hint="default"/>
+        <w:sz w:val="20"/>
+      </w:rPr>
+    </w:lvl>
+  </w:abstractNum>
+  <w:abstractNum w:abstractNumId="5" w15:restartNumberingAfterBreak="0">
+    <w:nsid w:val="56FA6A2F"/>
+    <w:multiLevelType w:val="multilevel"/>
+    <w:tmpl w:val="984C4000"/>
+    <w:lvl w:ilvl="0">
+      <w:start w:val="1"/>
+      <w:numFmt w:val="bullet"/>
+      <w:lvlText w:val=""/>
+      <w:lvlJc w:val="left"/>
+      <w:pPr>
+        <w:tabs>
+          <w:tab w:val="num" w:pos="1080"/>
+        </w:tabs>
+        <w:ind w:left="1080" w:hanging="360"/>
+      </w:pPr>
+      <w:rPr>
+        <w:rFonts w:ascii="Symbol" w:hAnsi="Symbol" w:hint="default"/>
+        <w:sz w:val="20"/>
+      </w:rPr>
+    </w:lvl>
+    <w:lvl w:ilvl="1" w:tentative="1">
+      <w:start w:val="1"/>
+      <w:numFmt w:val="bullet"/>
+      <w:lvlText w:val="o"/>
+      <w:lvlJc w:val="left"/>
+      <w:pPr>
+        <w:tabs>
+          <w:tab w:val="num" w:pos="1800"/>
+        </w:tabs>
+        <w:ind w:left="1800" w:hanging="360"/>
+      </w:pPr>
+      <w:rPr>
+        <w:rFonts w:ascii="Courier New" w:hAnsi="Courier New" w:hint="default"/>
+        <w:sz w:val="20"/>
+      </w:rPr>
+    </w:lvl>
+    <w:lvl w:ilvl="2" w:tentative="1">
+      <w:start w:val="1"/>
+      <w:numFmt w:val="bullet"/>
+      <w:lvlText w:val=""/>
+      <w:lvlJc w:val="left"/>
+      <w:pPr>
+        <w:tabs>
+          <w:tab w:val="num" w:pos="2520"/>
+        </w:tabs>
+        <w:ind w:left="2520" w:hanging="360"/>
+      </w:pPr>
+      <w:rPr>
+        <w:rFonts w:ascii="Wingdings" w:hAnsi="Wingdings" w:hint="default"/>
+        <w:sz w:val="20"/>
+      </w:rPr>
+    </w:lvl>
+    <w:lvl w:ilvl="3" w:tentative="1">
+      <w:start w:val="1"/>
+      <w:numFmt w:val="bullet"/>
+      <w:lvlText w:val=""/>
+      <w:lvlJc w:val="left"/>
+      <w:pPr>
+        <w:tabs>
+          <w:tab w:val="num" w:pos="3240"/>
+        </w:tabs>
+        <w:ind w:left="3240" w:hanging="360"/>
+      </w:pPr>
+      <w:rPr>
+        <w:rFonts w:ascii="Wingdings" w:hAnsi="Wingdings" w:hint="default"/>
+        <w:sz w:val="20"/>
+      </w:rPr>
+    </w:lvl>
+    <w:lvl w:ilvl="4" w:tentative="1">
+      <w:start w:val="1"/>
+      <w:numFmt w:val="bullet"/>
+      <w:lvlText w:val=""/>
+      <w:lvlJc w:val="left"/>
+      <w:pPr>
+        <w:tabs>
+          <w:tab w:val="num" w:pos="3960"/>
+        </w:tabs>
+        <w:ind w:left="3960" w:hanging="360"/>
+      </w:pPr>
+      <w:rPr>
+        <w:rFonts w:ascii="Wingdings" w:hAnsi="Wingdings" w:hint="default"/>
+        <w:sz w:val="20"/>
+      </w:rPr>
+    </w:lvl>
+    <w:lvl w:ilvl="5" w:tentative="1">
+      <w:start w:val="1"/>
+      <w:numFmt w:val="bullet"/>
+      <w:lvlText w:val=""/>
+      <w:lvlJc w:val="left"/>
+      <w:pPr>
+        <w:tabs>
+          <w:tab w:val="num" w:pos="4680"/>
+        </w:tabs>
+        <w:ind w:left="4680" w:hanging="360"/>
+      </w:pPr>
+      <w:rPr>
+        <w:rFonts w:ascii="Wingdings" w:hAnsi="Wingdings" w:hint="default"/>
+        <w:sz w:val="20"/>
+      </w:rPr>
+    </w:lvl>
+    <w:lvl w:ilvl="6" w:tentative="1">
+      <w:start w:val="1"/>
+      <w:numFmt w:val="bullet"/>
+      <w:lvlText w:val=""/>
+      <w:lvlJc w:val="left"/>
+      <w:pPr>
+        <w:tabs>
+          <w:tab w:val="num" w:pos="5400"/>
+        </w:tabs>
+        <w:ind w:left="5400" w:hanging="360"/>
+      </w:pPr>
+      <w:rPr>
+        <w:rFonts w:ascii="Wingdings" w:hAnsi="Wingdings" w:hint="default"/>
+        <w:sz w:val="20"/>
+      </w:rPr>
+    </w:lvl>
+    <w:lvl w:ilvl="7" w:tentative="1">
+      <w:start w:val="1"/>
+      <w:numFmt w:val="bullet"/>
+      <w:lvlText w:val=""/>
+      <w:lvlJc w:val="left"/>
+      <w:pPr>
+        <w:tabs>
+          <w:tab w:val="num" w:pos="6120"/>
+        </w:tabs>
+        <w:ind w:left="6120" w:hanging="360"/>
+      </w:pPr>
+      <w:rPr>
+        <w:rFonts w:ascii="Wingdings" w:hAnsi="Wingdings" w:hint="default"/>
+        <w:sz w:val="20"/>
+      </w:rPr>
+    </w:lvl>
+    <w:lvl w:ilvl="8" w:tentative="1">
+      <w:start w:val="1"/>
+      <w:numFmt w:val="bullet"/>
+      <w:lvlText w:val=""/>
+      <w:lvlJc w:val="left"/>
+      <w:pPr>
+        <w:tabs>
+          <w:tab w:val="num" w:pos="6840"/>
+        </w:tabs>
+        <w:ind w:left="6840" w:hanging="360"/>
+      </w:pPr>
+      <w:rPr>
+        <w:rFonts w:ascii="Wingdings" w:hAnsi="Wingdings" w:hint="default"/>
+        <w:sz w:val="20"/>
+      </w:rPr>
+    </w:lvl>
+  </w:abstractNum>
+  <w:abstractNum w:abstractNumId="6" w15:restartNumberingAfterBreak="0">
+    <w:nsid w:val="581A2201"/>
+    <w:multiLevelType w:val="multilevel"/>
+    <w:tmpl w:val="633A261E"/>
+    <w:lvl w:ilvl="0">
+      <w:start w:val="1"/>
+      <w:numFmt w:val="bullet"/>
+      <w:lvlText w:val=""/>
+      <w:lvlJc w:val="left"/>
+      <w:pPr>
+        <w:tabs>
+          <w:tab w:val="num" w:pos="720"/>
+        </w:tabs>
+        <w:ind w:left="720" w:hanging="360"/>
+      </w:pPr>
+      <w:rPr>
+        <w:rFonts w:ascii="Symbol" w:hAnsi="Symbol" w:hint="default"/>
+        <w:sz w:val="20"/>
+      </w:rPr>
+    </w:lvl>
+    <w:lvl w:ilvl="1" w:tentative="1">
+      <w:start w:val="1"/>
+      <w:numFmt w:val="bullet"/>
+      <w:lvlText w:val="o"/>
+      <w:lvlJc w:val="left"/>
+      <w:pPr>
+        <w:tabs>
+          <w:tab w:val="num" w:pos="1440"/>
+        </w:tabs>
+        <w:ind w:left="1440" w:hanging="360"/>
+      </w:pPr>
+      <w:rPr>
+        <w:rFonts w:ascii="Courier New" w:hAnsi="Courier New" w:hint="default"/>
+        <w:sz w:val="20"/>
+      </w:rPr>
+    </w:lvl>
+    <w:lvl w:ilvl="2" w:tentative="1">
+      <w:start w:val="1"/>
+      <w:numFmt w:val="bullet"/>
+      <w:lvlText w:val=""/>
+      <w:lvlJc w:val="left"/>
+      <w:pPr>
+        <w:tabs>
+          <w:tab w:val="num" w:pos="2160"/>
+        </w:tabs>
+        <w:ind w:left="2160" w:hanging="360"/>
+      </w:pPr>
+      <w:rPr>
+        <w:rFonts w:ascii="Wingdings" w:hAnsi="Wingdings" w:hint="default"/>
+        <w:sz w:val="20"/>
+      </w:rPr>
+    </w:lvl>
+    <w:lvl w:ilvl="3" w:tentative="1">
+      <w:start w:val="1"/>
+      <w:numFmt w:val="bullet"/>
+      <w:lvlText w:val=""/>
+      <w:lvlJc w:val="left"/>
+      <w:pPr>
+        <w:tabs>
+          <w:tab w:val="num" w:pos="2880"/>
+        </w:tabs>
+        <w:ind w:left="2880" w:hanging="360"/>
+      </w:pPr>
+      <w:rPr>
+        <w:rFonts w:ascii="Wingdings" w:hAnsi="Wingdings" w:hint="default"/>
+        <w:sz w:val="20"/>
+      </w:rPr>
+    </w:lvl>
+    <w:lvl w:ilvl="4" w:tentative="1">
+      <w:start w:val="1"/>
+      <w:numFmt w:val="bullet"/>
+      <w:lvlText w:val=""/>
+      <w:lvlJc w:val="left"/>
+      <w:pPr>
+        <w:tabs>
+          <w:tab w:val="num" w:pos="3600"/>
+        </w:tabs>
+        <w:ind w:left="3600" w:hanging="360"/>
+      </w:pPr>
+      <w:rPr>
+        <w:rFonts w:ascii="Wingdings" w:hAnsi="Wingdings" w:hint="default"/>
+        <w:sz w:val="20"/>
+      </w:rPr>
+    </w:lvl>
+    <w:lvl w:ilvl="5" w:tentative="1">
+      <w:start w:val="1"/>
+      <w:numFmt w:val="bullet"/>
+      <w:lvlText w:val=""/>
+      <w:lvlJc w:val="left"/>
+      <w:pPr>
+        <w:tabs>
+          <w:tab w:val="num" w:pos="4320"/>
+        </w:tabs>
+        <w:ind w:left="4320" w:hanging="360"/>
+      </w:pPr>
+      <w:rPr>
+        <w:rFonts w:ascii="Wingdings" w:hAnsi="Wingdings" w:hint="default"/>
+        <w:sz w:val="20"/>
+      </w:rPr>
+    </w:lvl>
+    <w:lvl w:ilvl="6" w:tentative="1">
+      <w:start w:val="1"/>
+      <w:numFmt w:val="bullet"/>
+      <w:lvlText w:val=""/>
+      <w:lvlJc w:val="left"/>
+      <w:pPr>
+        <w:tabs>
+          <w:tab w:val="num" w:pos="5040"/>
+        </w:tabs>
+        <w:ind w:left="5040" w:hanging="360"/>
+      </w:pPr>
+      <w:rPr>
+        <w:rFonts w:ascii="Wingdings" w:hAnsi="Wingdings" w:hint="default"/>
+        <w:sz w:val="20"/>
+      </w:rPr>
+    </w:lvl>
+    <w:lvl w:ilvl="7" w:tentative="1">
+      <w:start w:val="1"/>
+      <w:numFmt w:val="bullet"/>
+      <w:lvlText w:val=""/>
+      <w:lvlJc w:val="left"/>
+      <w:pPr>
+        <w:tabs>
+          <w:tab w:val="num" w:pos="5760"/>
+        </w:tabs>
+        <w:ind w:left="5760" w:hanging="360"/>
+      </w:pPr>
+      <w:rPr>
+        <w:rFonts w:ascii="Wingdings" w:hAnsi="Wingdings" w:hint="default"/>
+        <w:sz w:val="20"/>
+      </w:rPr>
+    </w:lvl>
+    <w:lvl w:ilvl="8" w:tentative="1">
+      <w:start w:val="1"/>
+      <w:numFmt w:val="bullet"/>
+      <w:lvlText w:val=""/>
+      <w:lvlJc w:val="left"/>
+      <w:pPr>
+        <w:tabs>
+          <w:tab w:val="num" w:pos="6480"/>
+        </w:tabs>
+        <w:ind w:left="6480" w:hanging="360"/>
+      </w:pPr>
+      <w:rPr>
+        <w:rFonts w:ascii="Wingdings" w:hAnsi="Wingdings" w:hint="default"/>
+        <w:sz w:val="20"/>
+      </w:rPr>
+    </w:lvl>
+  </w:abstractNum>
+  <w:abstractNum w:abstractNumId="7" w15:restartNumberingAfterBreak="0">
+    <w:nsid w:val="7EB71152"/>
+    <w:multiLevelType w:val="multilevel"/>
+    <w:tmpl w:val="5602E20A"/>
+    <w:lvl w:ilvl="0">
+      <w:start w:val="1"/>
+      <w:numFmt w:val="bullet"/>
+      <w:lvlText w:val=""/>
+      <w:lvlJc w:val="left"/>
+      <w:pPr>
+        <w:tabs>
+          <w:tab w:val="num" w:pos="1080"/>
+        </w:tabs>
+        <w:ind w:left="1080" w:hanging="360"/>
+      </w:pPr>
+      <w:rPr>
+        <w:rFonts w:ascii="Symbol" w:hAnsi="Symbol" w:hint="default"/>
+        <w:sz w:val="20"/>
+      </w:rPr>
+    </w:lvl>
+    <w:lvl w:ilvl="1" w:tentative="1">
+      <w:start w:val="1"/>
+      <w:numFmt w:val="bullet"/>
+      <w:lvlText w:val="o"/>
+      <w:lvlJc w:val="left"/>
+      <w:pPr>
+        <w:tabs>
+          <w:tab w:val="num" w:pos="1800"/>
+        </w:tabs>
+        <w:ind w:left="1800" w:hanging="360"/>
+      </w:pPr>
+      <w:rPr>
+        <w:rFonts w:ascii="Courier New" w:hAnsi="Courier New" w:hint="default"/>
+        <w:sz w:val="20"/>
+      </w:rPr>
+    </w:lvl>
+    <w:lvl w:ilvl="2" w:tentative="1">
+      <w:start w:val="1"/>
+      <w:numFmt w:val="bullet"/>
+      <w:lvlText w:val=""/>
+      <w:lvlJc w:val="left"/>
+      <w:pPr>
+        <w:tabs>
+          <w:tab w:val="num" w:pos="2520"/>
+        </w:tabs>
+        <w:ind w:left="2520" w:hanging="360"/>
+      </w:pPr>
+      <w:rPr>
+        <w:rFonts w:ascii="Wingdings" w:hAnsi="Wingdings" w:hint="default"/>
+        <w:sz w:val="20"/>
+      </w:rPr>
+    </w:lvl>
+    <w:lvl w:ilvl="3" w:tentative="1">
+      <w:start w:val="1"/>
+      <w:numFmt w:val="bullet"/>
+      <w:lvlText w:val=""/>
+      <w:lvlJc w:val="left"/>
+      <w:pPr>
+        <w:tabs>
+          <w:tab w:val="num" w:pos="3240"/>
+        </w:tabs>
+        <w:ind w:left="3240" w:hanging="360"/>
+      </w:pPr>
+      <w:rPr>
+        <w:rFonts w:ascii="Wingdings" w:hAnsi="Wingdings" w:hint="default"/>
+        <w:sz w:val="20"/>
+      </w:rPr>
+    </w:lvl>
+    <w:lvl w:ilvl="4" w:tentative="1">
+      <w:start w:val="1"/>
+      <w:numFmt w:val="bullet"/>
+      <w:lvlText w:val=""/>
+      <w:lvlJc w:val="left"/>
+      <w:pPr>
+        <w:tabs>
+          <w:tab w:val="num" w:pos="3960"/>
+        </w:tabs>
+        <w:ind w:left="3960" w:hanging="360"/>
+      </w:pPr>
+      <w:rPr>
+        <w:rFonts w:ascii="Wingdings" w:hAnsi="Wingdings" w:hint="default"/>
+        <w:sz w:val="20"/>
+      </w:rPr>
+    </w:lvl>
+    <w:lvl w:ilvl="5" w:tentative="1">
+      <w:start w:val="1"/>
+      <w:numFmt w:val="bullet"/>
+      <w:lvlText w:val=""/>
+      <w:lvlJc w:val="left"/>
+      <w:pPr>
+        <w:tabs>
+          <w:tab w:val="num" w:pos="4680"/>
+        </w:tabs>
+        <w:ind w:left="4680" w:hanging="360"/>
+      </w:pPr>
+      <w:rPr>
+        <w:rFonts w:ascii="Wingdings" w:hAnsi="Wingdings" w:hint="default"/>
+        <w:sz w:val="20"/>
+      </w:rPr>
+    </w:lvl>
+    <w:lvl w:ilvl="6" w:tentative="1">
+      <w:start w:val="1"/>
+      <w:numFmt w:val="bullet"/>
+      <w:lvlText w:val=""/>
+      <w:lvlJc w:val="left"/>
+      <w:pPr>
+        <w:tabs>
+          <w:tab w:val="num" w:pos="5400"/>
+        </w:tabs>
+        <w:ind w:left="5400" w:hanging="360"/>
+      </w:pPr>
+      <w:rPr>
+        <w:rFonts w:ascii="Wingdings" w:hAnsi="Wingdings" w:hint="default"/>
+        <w:sz w:val="20"/>
+      </w:rPr>
+    </w:lvl>
+    <w:lvl w:ilvl="7" w:tentative="1">
+      <w:start w:val="1"/>
+      <w:numFmt w:val="bullet"/>
+      <w:lvlText w:val=""/>
+      <w:lvlJc w:val="left"/>
+      <w:pPr>
+        <w:tabs>
+          <w:tab w:val="num" w:pos="6120"/>
+        </w:tabs>
+        <w:ind w:left="6120" w:hanging="360"/>
+      </w:pPr>
+      <w:rPr>
+        <w:rFonts w:ascii="Wingdings" w:hAnsi="Wingdings" w:hint="default"/>
+        <w:sz w:val="20"/>
+      </w:rPr>
+    </w:lvl>
+    <w:lvl w:ilvl="8" w:tentative="1">
+      <w:start w:val="1"/>
+      <w:numFmt w:val="bullet"/>
+      <w:lvlText w:val=""/>
+      <w:lvlJc w:val="left"/>
+      <w:pPr>
+        <w:tabs>
+          <w:tab w:val="num" w:pos="6840"/>
+        </w:tabs>
+        <w:ind w:left="6840" w:hanging="360"/>
+      </w:pPr>
+      <w:rPr>
+        <w:rFonts w:ascii="Wingdings" w:hAnsi="Wingdings" w:hint="default"/>
+        <w:sz w:val="20"/>
+      </w:rPr>
+    </w:lvl>
+  </w:abstractNum>
   <w:num w:numId="1">
+    <w:abstractNumId w:val="3"/>
+  </w:num>
+  <w:num w:numId="2">
+    <w:abstractNumId w:val="5"/>
+  </w:num>
+  <w:num w:numId="3">
+    <w:abstractNumId w:val="2"/>
+  </w:num>
+  <w:num w:numId="4">
+    <w:abstractNumId w:val="1"/>
+  </w:num>
+  <w:num w:numId="5">
+    <w:abstractNumId w:val="7"/>
+  </w:num>
+  <w:num w:numId="6">
+    <w:abstractNumId w:val="6"/>
+  </w:num>
+  <w:num w:numId="7">
+    <w:abstractNumId w:val="4"/>
+  </w:num>
+  <w:num w:numId="8">
     <w:abstractNumId w:val="0"/>
   </w:num>
 </w:numbering>
@@ -1230,6 +4068,70 @@
       <w:autoSpaceDN w:val="0"/>
     </w:pPr>
   </w:style>
+  <w:style w:type="paragraph" w:styleId="2">
+    <w:name w:val="heading 2"/>
+    <w:basedOn w:val="a"/>
+    <w:link w:val="2Char"/>
+    <w:uiPriority w:val="9"/>
+    <w:qFormat/>
+    <w:rsid w:val="00065430"/>
+    <w:pPr>
+      <w:widowControl/>
+      <w:wordWrap/>
+      <w:autoSpaceDE/>
+      <w:autoSpaceDN/>
+      <w:spacing w:before="100" w:beforeAutospacing="1" w:after="100" w:afterAutospacing="1" w:line="240" w:lineRule="auto"/>
+      <w:jc w:val="left"/>
+      <w:outlineLvl w:val="1"/>
+    </w:pPr>
+    <w:rPr>
+      <w:rFonts w:ascii="굴림" w:eastAsia="굴림" w:hAnsi="굴림" w:cs="굴림"/>
+      <w:b/>
+      <w:bCs/>
+      <w:kern w:val="0"/>
+      <w:sz w:val="36"/>
+      <w:szCs w:val="36"/>
+    </w:rPr>
+  </w:style>
+  <w:style w:type="paragraph" w:styleId="3">
+    <w:name w:val="heading 3"/>
+    <w:basedOn w:val="a"/>
+    <w:next w:val="a"/>
+    <w:link w:val="3Char"/>
+    <w:uiPriority w:val="9"/>
+    <w:semiHidden/>
+    <w:unhideWhenUsed/>
+    <w:qFormat/>
+    <w:rsid w:val="00CE7D9D"/>
+    <w:pPr>
+      <w:keepNext/>
+      <w:ind w:leftChars="300" w:left="300" w:hangingChars="200" w:hanging="2000"/>
+      <w:outlineLvl w:val="2"/>
+    </w:pPr>
+    <w:rPr>
+      <w:rFonts w:asciiTheme="majorHAnsi" w:eastAsiaTheme="majorEastAsia" w:hAnsiTheme="majorHAnsi" w:cstheme="majorBidi"/>
+    </w:rPr>
+  </w:style>
+  <w:style w:type="paragraph" w:styleId="4">
+    <w:name w:val="heading 4"/>
+    <w:basedOn w:val="a"/>
+    <w:next w:val="a"/>
+    <w:link w:val="4Char"/>
+    <w:uiPriority w:val="9"/>
+    <w:semiHidden/>
+    <w:unhideWhenUsed/>
+    <w:qFormat/>
+    <w:rsid w:val="00CE7D9D"/>
+    <w:pPr>
+      <w:keepNext/>
+      <w:ind w:leftChars="400" w:left="400" w:hangingChars="200" w:hanging="2000"/>
+      <w:outlineLvl w:val="3"/>
+    </w:pPr>
+    <w:rPr>
+      <w:b/>
+      <w:bCs/>
+    </w:rPr>
+  </w:style>
   <w:style w:type="character" w:default="1" w:styleId="a0">
     <w:name w:val="Default Paragraph Font"/>
     <w:uiPriority w:val="1"/>
@@ -1266,6 +4168,99 @@
     <w:pPr>
       <w:ind w:leftChars="400" w:left="800"/>
     </w:pPr>
+  </w:style>
+  <w:style w:type="character" w:styleId="HTML">
+    <w:name w:val="HTML Code"/>
+    <w:basedOn w:val="a0"/>
+    <w:uiPriority w:val="99"/>
+    <w:semiHidden/>
+    <w:unhideWhenUsed/>
+    <w:rsid w:val="003502B0"/>
+    <w:rPr>
+      <w:rFonts w:ascii="굴림체" w:eastAsia="굴림체" w:hAnsi="굴림체" w:cs="굴림체"/>
+      <w:sz w:val="24"/>
+      <w:szCs w:val="24"/>
+    </w:rPr>
+  </w:style>
+  <w:style w:type="character" w:customStyle="1" w:styleId="hljs-section">
+    <w:name w:val="hljs-section"/>
+    <w:basedOn w:val="a0"/>
+    <w:rsid w:val="003502B0"/>
+  </w:style>
+  <w:style w:type="character" w:customStyle="1" w:styleId="hljs-emphasis">
+    <w:name w:val="hljs-emphasis"/>
+    <w:basedOn w:val="a0"/>
+    <w:rsid w:val="003502B0"/>
+  </w:style>
+  <w:style w:type="character" w:customStyle="1" w:styleId="hljs-bullet">
+    <w:name w:val="hljs-bullet"/>
+    <w:basedOn w:val="a0"/>
+    <w:rsid w:val="003502B0"/>
+  </w:style>
+  <w:style w:type="character" w:customStyle="1" w:styleId="hljs-code">
+    <w:name w:val="hljs-code"/>
+    <w:basedOn w:val="a0"/>
+    <w:rsid w:val="003502B0"/>
+  </w:style>
+  <w:style w:type="character" w:customStyle="1" w:styleId="2Char">
+    <w:name w:val="제목 2 Char"/>
+    <w:basedOn w:val="a0"/>
+    <w:link w:val="2"/>
+    <w:uiPriority w:val="9"/>
+    <w:rsid w:val="00065430"/>
+    <w:rPr>
+      <w:rFonts w:ascii="굴림" w:eastAsia="굴림" w:hAnsi="굴림" w:cs="굴림"/>
+      <w:b/>
+      <w:bCs/>
+      <w:kern w:val="0"/>
+      <w:sz w:val="36"/>
+      <w:szCs w:val="36"/>
+    </w:rPr>
+  </w:style>
+  <w:style w:type="paragraph" w:styleId="a4">
+    <w:name w:val="Normal (Web)"/>
+    <w:basedOn w:val="a"/>
+    <w:uiPriority w:val="99"/>
+    <w:semiHidden/>
+    <w:unhideWhenUsed/>
+    <w:rsid w:val="00065430"/>
+    <w:pPr>
+      <w:widowControl/>
+      <w:wordWrap/>
+      <w:autoSpaceDE/>
+      <w:autoSpaceDN/>
+      <w:spacing w:before="100" w:beforeAutospacing="1" w:after="100" w:afterAutospacing="1" w:line="240" w:lineRule="auto"/>
+      <w:jc w:val="left"/>
+    </w:pPr>
+    <w:rPr>
+      <w:rFonts w:ascii="굴림" w:eastAsia="굴림" w:hAnsi="굴림" w:cs="굴림"/>
+      <w:kern w:val="0"/>
+      <w:sz w:val="24"/>
+      <w:szCs w:val="24"/>
+    </w:rPr>
+  </w:style>
+  <w:style w:type="character" w:customStyle="1" w:styleId="3Char">
+    <w:name w:val="제목 3 Char"/>
+    <w:basedOn w:val="a0"/>
+    <w:link w:val="3"/>
+    <w:uiPriority w:val="9"/>
+    <w:semiHidden/>
+    <w:rsid w:val="00CE7D9D"/>
+    <w:rPr>
+      <w:rFonts w:asciiTheme="majorHAnsi" w:eastAsiaTheme="majorEastAsia" w:hAnsiTheme="majorHAnsi" w:cstheme="majorBidi"/>
+    </w:rPr>
+  </w:style>
+  <w:style w:type="character" w:customStyle="1" w:styleId="4Char">
+    <w:name w:val="제목 4 Char"/>
+    <w:basedOn w:val="a0"/>
+    <w:link w:val="4"/>
+    <w:uiPriority w:val="9"/>
+    <w:semiHidden/>
+    <w:rsid w:val="00CE7D9D"/>
+    <w:rPr>
+      <w:b/>
+      <w:bCs/>
+    </w:rPr>
   </w:style>
 </w:styles>
 </file>

</xml_diff>

<commit_message>
Fix layout tab logic and sidebar menu sync
</commit_message>
<xml_diff>
--- a/내가 만들고 싶은.docx
+++ b/내가 만들고 싶은.docx
@@ -801,7 +801,6 @@
         </w:numPr>
         <w:ind w:leftChars="0"/>
       </w:pPr>
-      <w:bookmarkStart w:id="0" w:name="_GoBack"/>
       <w:r>
         <w:rPr>
           <w:rFonts w:hint="eastAsia"/>
@@ -1232,7 +1231,7 @@
         </w:numPr>
         <w:ind w:leftChars="0"/>
         <w:rPr>
-          <w:rFonts w:asciiTheme="minorEastAsia" w:hAnsiTheme="minorEastAsia" w:hint="eastAsia"/>
+          <w:rFonts w:asciiTheme="minorEastAsia" w:hAnsiTheme="minorEastAsia"/>
           <w:szCs w:val="20"/>
         </w:rPr>
       </w:pPr>
@@ -2240,7 +2239,6 @@
         <w:t xml:space="preserve"> 사후 분석 보고서를 자동 생성하여 시스템 스스로 '학습 및 프롬프트 피드백'이 일어나도록 루프를 만듭니다.</w:t>
       </w:r>
     </w:p>
-    <w:bookmarkEnd w:id="0"/>
     <w:p/>
     <w:p>
       <w:pPr>
@@ -2495,6 +2493,743 @@
       </w:r>
     </w:p>
     <w:p/>
+    <w:p/>
+    <w:p/>
+    <w:p/>
+    <w:p/>
+    <w:p/>
+    <w:p/>
+    <w:p/>
+    <w:p/>
+    <w:p/>
+    <w:p/>
+    <w:p/>
+    <w:p/>
+    <w:p/>
+    <w:p>
+      <w:r>
+        <w:lastRenderedPageBreak/>
+        <w:t>목적**: 거래대금 급증 + 외인/기관 수급 + 뉴스 재료를 종합해 매수 후보 종목을 스코어링하고, 매일 저녁/아침 리포트를 이메일·카카오톡으로 발송</w:t>
+      </w:r>
+    </w:p>
+    <w:p>
+      <w:r>
+        <w:t>자동화**: GitHub Actions (`</w:t>
+      </w:r>
+      <w:proofErr w:type="gramStart"/>
+      <w:r>
+        <w:t>.</w:t>
+      </w:r>
+      <w:proofErr w:type="spellStart"/>
+      <w:r>
+        <w:t>github</w:t>
+      </w:r>
+      <w:proofErr w:type="spellEnd"/>
+      <w:proofErr w:type="gramEnd"/>
+      <w:r>
+        <w:t>/workflows/</w:t>
+      </w:r>
+      <w:proofErr w:type="spellStart"/>
+      <w:r>
+        <w:t>schedule.yml</w:t>
+      </w:r>
+      <w:proofErr w:type="spellEnd"/>
+      <w:r>
+        <w:t>`) — 매일 UTC 23:50/07:30 (KST 08:50/16:30) 자동 실행</w:t>
+      </w:r>
+    </w:p>
+    <w:p>
+      <w:r>
+        <w:t xml:space="preserve">데이터 소스**: 네이버 금융 HTML </w:t>
+      </w:r>
+      <w:proofErr w:type="spellStart"/>
+      <w:r>
+        <w:t>스크래핑</w:t>
+      </w:r>
+      <w:proofErr w:type="spellEnd"/>
+      <w:r>
+        <w:t xml:space="preserve"> (requests + BeautifulSoup4). </w:t>
+      </w:r>
+      <w:proofErr w:type="spellStart"/>
+      <w:r>
+        <w:t>pykrx</w:t>
+      </w:r>
+      <w:proofErr w:type="spellEnd"/>
+      <w:r>
+        <w:t xml:space="preserve">는 Python 3.14 </w:t>
+      </w:r>
+      <w:proofErr w:type="spellStart"/>
+      <w:r>
+        <w:t>비호환</w:t>
+      </w:r>
+      <w:proofErr w:type="spellEnd"/>
+      <w:r>
+        <w:t xml:space="preserve"> + KRX 로그인 필요 문제로 폐기됨</w:t>
+      </w:r>
+    </w:p>
+    <w:p>
+      <w:r>
+        <w:t xml:space="preserve">AI 모듈**: </w:t>
+      </w:r>
+      <w:proofErr w:type="spellStart"/>
+      <w:r>
+        <w:t>Groq</w:t>
+      </w:r>
+      <w:proofErr w:type="spellEnd"/>
+      <w:r>
+        <w:t xml:space="preserve"> </w:t>
+      </w:r>
+      <w:proofErr w:type="spellStart"/>
+      <w:r>
+        <w:t>LLaMA</w:t>
+      </w:r>
+      <w:proofErr w:type="spellEnd"/>
+      <w:r>
+        <w:t xml:space="preserve"> 3.3 70B (재료 분석, 시장 코멘트, 섹터 트렌드 코멘트 생성)</w:t>
+      </w:r>
+    </w:p>
+    <w:p>
+      <w:pPr>
+        <w:rPr>
+          <w:rFonts w:hint="eastAsia"/>
+        </w:rPr>
+      </w:pPr>
+    </w:p>
+    <w:p>
+      <w:r>
+        <w:t xml:space="preserve">## </w:t>
+      </w:r>
+      <w:r>
+        <w:t>1</w:t>
+      </w:r>
+      <w:r>
+        <w:t>. 파이프라인 구조 (5단계 + 별도 트랙)</w:t>
+      </w:r>
+    </w:p>
+    <w:p>
+      <w:r>
+        <w:t>| 파일 | 역할 |</w:t>
+      </w:r>
+    </w:p>
+    <w:p>
+      <w:r>
+        <w:t>|---|---|</w:t>
+      </w:r>
+    </w:p>
+    <w:p>
+      <w:r>
+        <w:t xml:space="preserve">| `skills_real.py` | 네이버 금융 </w:t>
+      </w:r>
+      <w:proofErr w:type="spellStart"/>
+      <w:r>
+        <w:t>스크래핑</w:t>
+      </w:r>
+      <w:proofErr w:type="spellEnd"/>
+      <w:r>
+        <w:t xml:space="preserve"> — 시세, 거래량, 외인/기관 수급 |</w:t>
+      </w:r>
+    </w:p>
+    <w:p>
+      <w:r>
+        <w:t xml:space="preserve">| `agent_core.py` | 5단계 분석 파이프라인 오케스트레이션 + 모멘텀 </w:t>
+      </w:r>
+      <w:proofErr w:type="spellStart"/>
+      <w:r>
+        <w:t>스코어링</w:t>
+      </w:r>
+      <w:proofErr w:type="spellEnd"/>
+      <w:r>
+        <w:t xml:space="preserve"> |</w:t>
+      </w:r>
+    </w:p>
+    <w:p>
+      <w:r>
+        <w:t xml:space="preserve">| `gemini_analyzer.py` | </w:t>
+      </w:r>
+      <w:proofErr w:type="spellStart"/>
+      <w:r>
+        <w:t>Groq</w:t>
+      </w:r>
+      <w:proofErr w:type="spellEnd"/>
+      <w:r>
+        <w:t xml:space="preserve"> </w:t>
+      </w:r>
+      <w:proofErr w:type="spellStart"/>
+      <w:r>
+        <w:t>LLaMA</w:t>
+      </w:r>
+      <w:proofErr w:type="spellEnd"/>
+      <w:r>
+        <w:t xml:space="preserve"> 연동 — 재료 분석, 시장 코멘트, 섹터 트렌드 코멘트 |</w:t>
+      </w:r>
+    </w:p>
+    <w:p>
+      <w:r>
+        <w:t xml:space="preserve">| `validate_predictions.py` | 일일 </w:t>
+      </w:r>
+      <w:proofErr w:type="spellStart"/>
+      <w:r>
+        <w:t>백테스트</w:t>
+      </w:r>
+      <w:proofErr w:type="spellEnd"/>
+      <w:r>
+        <w:t>/검증 (HIT/PARTIAL/MISS) |</w:t>
+      </w:r>
+    </w:p>
+    <w:p>
+      <w:r>
+        <w:t>| `email_notify.py` | Gmail SMTP 이메일 발송 |</w:t>
+      </w:r>
+    </w:p>
+    <w:p>
+      <w:r>
+        <w:t>| `sector_trend.py` | (신규) 섹터/업종 트렌드 조기 감지 — 별도 트랙 |</w:t>
+      </w:r>
+    </w:p>
+    <w:p>
+      <w:r>
+        <w:t xml:space="preserve">| `run_agent.py` | 통합 </w:t>
+      </w:r>
+      <w:proofErr w:type="spellStart"/>
+      <w:r>
+        <w:t>실행기</w:t>
+      </w:r>
+      <w:proofErr w:type="spellEnd"/>
+      <w:r>
+        <w:t xml:space="preserve"> — `--mode evening/morning/all/trend` |</w:t>
+      </w:r>
+    </w:p>
+    <w:p>
+      <w:r>
+        <w:t xml:space="preserve">| `streamlit_app.py` | </w:t>
+      </w:r>
+      <w:proofErr w:type="spellStart"/>
+      <w:r>
+        <w:t>Streamlit</w:t>
+      </w:r>
+      <w:proofErr w:type="spellEnd"/>
+      <w:r>
+        <w:t xml:space="preserve"> Cloud 대시보드 |</w:t>
+      </w:r>
+    </w:p>
+    <w:p/>
+    <w:p>
+      <w:r>
+        <w:t xml:space="preserve">**STEP 1 — 거래대금 폭발 종목 </w:t>
+      </w:r>
+      <w:proofErr w:type="spellStart"/>
+      <w:r>
+        <w:t>스크리닝</w:t>
+      </w:r>
+      <w:proofErr w:type="spellEnd"/>
+      <w:r>
+        <w:t>** (`</w:t>
+      </w:r>
+      <w:proofErr w:type="spellStart"/>
+      <w:r>
+        <w:t>fetch_market_momentum</w:t>
+      </w:r>
+      <w:proofErr w:type="spellEnd"/>
+      <w:r>
+        <w:t>()`)</w:t>
+      </w:r>
+    </w:p>
+    <w:p>
+      <w:r>
+        <w:t>1. KOSPI 10페이지(~</w:t>
+      </w:r>
+      <w:proofErr w:type="spellStart"/>
+      <w:r>
+        <w:t>시총</w:t>
+      </w:r>
+      <w:proofErr w:type="spellEnd"/>
+      <w:r>
+        <w:t xml:space="preserve"> 상위 500행), KOSDAQ 6페이지(~</w:t>
+      </w:r>
+      <w:proofErr w:type="spellStart"/>
+      <w:r>
+        <w:t>시총</w:t>
+      </w:r>
+      <w:proofErr w:type="spellEnd"/>
+      <w:r>
+        <w:t xml:space="preserve"> 상위 300행) 스캔, ETF 제외</w:t>
+      </w:r>
+    </w:p>
+    <w:p>
+      <w:r>
+        <w:t>2. 거래대금 500억↑ 필터 → 상위 100종목까지 세부 분석 대상</w:t>
+      </w:r>
+    </w:p>
+    <w:p>
+      <w:r>
+        <w:t xml:space="preserve">3. RSI ≤ 80, (거래대금이 상위 30% </w:t>
+      </w:r>
+      <w:proofErr w:type="spellStart"/>
+      <w:r>
+        <w:t>임계값</w:t>
+      </w:r>
+      <w:proofErr w:type="spellEnd"/>
+      <w:r>
+        <w:t xml:space="preserve"> 대비 2배↑ 또는 상위 30% 이내) 조건 통과 시 최종 후보</w:t>
+      </w:r>
+    </w:p>
+    <w:p>
+      <w:r>
+        <w:t>4. 거래대금 순 정렬 후 상위 20종목(`</w:t>
+      </w:r>
+      <w:proofErr w:type="spellStart"/>
+      <w:r>
+        <w:t>top_n</w:t>
+      </w:r>
+      <w:proofErr w:type="spellEnd"/>
+      <w:r>
+        <w:t>`) 반환</w:t>
+      </w:r>
+    </w:p>
+    <w:p/>
+    <w:p>
+      <w:r>
+        <w:lastRenderedPageBreak/>
+        <w:t>**STEP 2 — 외인·기관 수급 분석** (`</w:t>
+      </w:r>
+      <w:proofErr w:type="spellStart"/>
+      <w:r>
+        <w:t>analyze_supply_demand</w:t>
+      </w:r>
+      <w:proofErr w:type="spellEnd"/>
+      <w:r>
+        <w:t>()`)</w:t>
+      </w:r>
+    </w:p>
+    <w:p>
+      <w:r>
+        <w:t>- 조건: `(</w:t>
+      </w:r>
+      <w:proofErr w:type="spellStart"/>
+      <w:r>
+        <w:t>외인순매수</w:t>
+      </w:r>
+      <w:proofErr w:type="spellEnd"/>
+      <w:r>
+        <w:t xml:space="preserve"> + </w:t>
+      </w:r>
+      <w:proofErr w:type="spellStart"/>
+      <w:r>
+        <w:t>기관순매수</w:t>
+      </w:r>
+      <w:proofErr w:type="spellEnd"/>
+      <w:r>
+        <w:t>) &gt; 0`</w:t>
+      </w:r>
+    </w:p>
+    <w:p>
+      <w:r>
+        <w:t>- `</w:t>
+      </w:r>
+      <w:proofErr w:type="spellStart"/>
+      <w:r>
+        <w:t>supply_score</w:t>
+      </w:r>
+      <w:proofErr w:type="spellEnd"/>
+      <w:r>
+        <w:t xml:space="preserve"> = min(max(</w:t>
+      </w:r>
+      <w:proofErr w:type="spellStart"/>
+      <w:r>
+        <w:t>f+g</w:t>
+      </w:r>
+      <w:proofErr w:type="spellEnd"/>
+      <w:r>
+        <w:t>, 0) / max(거래대금×100, 1) × 10, 10)`</w:t>
+      </w:r>
+    </w:p>
+    <w:p/>
+    <w:p>
+      <w:r>
+        <w:t xml:space="preserve">**STEP 3 — 테마·재료 분석 및 </w:t>
+      </w:r>
+      <w:proofErr w:type="spellStart"/>
+      <w:r>
+        <w:t>가짜뉴스</w:t>
+      </w:r>
+      <w:proofErr w:type="spellEnd"/>
+      <w:r>
+        <w:t xml:space="preserve"> 필터** (`</w:t>
+      </w:r>
+      <w:proofErr w:type="spellStart"/>
+      <w:r>
+        <w:t>scan_theme_news</w:t>
+      </w:r>
+      <w:proofErr w:type="spellEnd"/>
+      <w:r>
+        <w:t>()`)</w:t>
+      </w:r>
+    </w:p>
+    <w:p>
+      <w:r>
+        <w:t xml:space="preserve">- </w:t>
+      </w:r>
+      <w:proofErr w:type="spellStart"/>
+      <w:r>
+        <w:t>Groq</w:t>
+      </w:r>
+      <w:proofErr w:type="spellEnd"/>
+      <w:r>
+        <w:t xml:space="preserve"> 기반 재료 유형 분류(`수주`/`정책`/`실적`/`테마`), 감성 점수, DART 리스크 플래그, </w:t>
+      </w:r>
+      <w:proofErr w:type="spellStart"/>
+      <w:r>
+        <w:t>가짜뉴스</w:t>
+      </w:r>
+      <w:proofErr w:type="spellEnd"/>
+      <w:r>
+        <w:t xml:space="preserve"> 필터</w:t>
+      </w:r>
+    </w:p>
+    <w:p/>
+    <w:p>
+      <w:r>
+        <w:t>**STEP 4 — 모멘텀 점수 산출** (`</w:t>
+      </w:r>
+      <w:proofErr w:type="spellStart"/>
+      <w:r>
+        <w:t>score_momentum</w:t>
+      </w:r>
+      <w:proofErr w:type="spellEnd"/>
+      <w:r>
+        <w:t>()`) — 아래 3번 항목 참조</w:t>
+      </w:r>
+    </w:p>
+    <w:p/>
+    <w:p>
+      <w:r>
+        <w:t>**STEP 4.5 — 시장 전체 흐름 분석** (`</w:t>
+      </w:r>
+      <w:proofErr w:type="spellStart"/>
+      <w:r>
+        <w:t>analyze_market_context</w:t>
+      </w:r>
+      <w:proofErr w:type="spellEnd"/>
+      <w:r>
+        <w:t>()`)</w:t>
+      </w:r>
+    </w:p>
+    <w:p>
+      <w:r>
+        <w:t xml:space="preserve">- 시장 코멘트 생성 + 섹터 트렌드 </w:t>
+      </w:r>
+      <w:proofErr w:type="spellStart"/>
+      <w:r>
+        <w:t>트랙용</w:t>
+      </w:r>
+      <w:proofErr w:type="spellEnd"/>
+      <w:r>
+        <w:t xml:space="preserve"> `</w:t>
+      </w:r>
+      <w:proofErr w:type="spellStart"/>
+      <w:r>
+        <w:t>theme_trend_log.json</w:t>
+      </w:r>
+      <w:proofErr w:type="spellEnd"/>
+      <w:r>
+        <w:t>` 일별 누적 저장</w:t>
+      </w:r>
+    </w:p>
+    <w:p/>
+    <w:p>
+      <w:r>
+        <w:t>**STEP 5 — 보고서 생성 (Top 10)**</w:t>
+      </w:r>
+    </w:p>
+    <w:p>
+      <w:r>
+        <w:t>- `</w:t>
+      </w:r>
+      <w:proofErr w:type="spellStart"/>
+      <w:r>
+        <w:t>predictions_log.json</w:t>
+      </w:r>
+      <w:proofErr w:type="spellEnd"/>
+      <w:r>
+        <w:t xml:space="preserve">` 기록 → 엑셀 리포트 → </w:t>
+      </w:r>
+      <w:proofErr w:type="spellStart"/>
+      <w:r>
+        <w:t>마크다운</w:t>
+      </w:r>
+      <w:proofErr w:type="spellEnd"/>
+      <w:r>
+        <w:t xml:space="preserve"> 리포트 → 이메일/</w:t>
+      </w:r>
+      <w:proofErr w:type="spellStart"/>
+      <w:r>
+        <w:t>카카오톡</w:t>
+      </w:r>
+      <w:proofErr w:type="spellEnd"/>
+      <w:r>
+        <w:t xml:space="preserve"> 발송</w:t>
+      </w:r>
+    </w:p>
+    <w:p/>
+    <w:p>
+      <w:r>
+        <w:t>**별도 트랙 — 섹터 트렌드 리포트** (`--mode trend`)</w:t>
+      </w:r>
+    </w:p>
+    <w:p>
+      <w:r>
+        <w:t>- `</w:t>
+      </w:r>
+      <w:proofErr w:type="spellStart"/>
+      <w:r>
+        <w:t>theme_trend_log.json</w:t>
+      </w:r>
+      <w:proofErr w:type="spellEnd"/>
+      <w:r>
+        <w:t xml:space="preserve">`의 최근 5일 데이터로 </w:t>
+      </w:r>
+      <w:proofErr w:type="spellStart"/>
+      <w:r>
+        <w:t>우상향</w:t>
+      </w:r>
+      <w:proofErr w:type="spellEnd"/>
+      <w:r>
+        <w:t xml:space="preserve"> 섹터 감지 → </w:t>
+      </w:r>
+      <w:proofErr w:type="spellStart"/>
+      <w:r>
+        <w:t>Groq</w:t>
+      </w:r>
+      <w:proofErr w:type="spellEnd"/>
+      <w:r>
+        <w:t xml:space="preserve"> 해외지표/정책 코멘트 → 전용 이메일 발송</w:t>
+      </w:r>
+    </w:p>
+    <w:p>
+      <w:r>
+        <w:t>- 매수/매도 스코어링과는 무관, 참고용</w:t>
+      </w:r>
+    </w:p>
+    <w:p/>
+    <w:p>
+      <w:r>
+        <w:t>---</w:t>
+      </w:r>
+    </w:p>
+    <w:p/>
+    <w:p>
+      <w:r>
+        <w:t>## 2.</w:t>
+      </w:r>
+      <w:r>
+        <w:t xml:space="preserve"> 이번 주 변경 이력 (2026-07-13 ~ 07-15)</w:t>
+      </w:r>
+    </w:p>
+    <w:p/>
+    <w:p>
+      <w:r>
+        <w:t xml:space="preserve">**1) RSI </w:t>
+      </w:r>
+      <w:proofErr w:type="spellStart"/>
+      <w:r>
+        <w:t>스코어링</w:t>
+      </w:r>
+      <w:proofErr w:type="spellEnd"/>
+      <w:r>
+        <w:t xml:space="preserve"> 밴드 재설계** — 45~60 최고점, </w:t>
+      </w:r>
+      <w:proofErr w:type="spellStart"/>
+      <w:r>
+        <w:t>과매도</w:t>
+      </w:r>
+      <w:proofErr w:type="spellEnd"/>
+      <w:r>
+        <w:t>(&lt;35)·</w:t>
+      </w:r>
+      <w:proofErr w:type="spellStart"/>
+      <w:r>
+        <w:t>과매수</w:t>
+      </w:r>
+      <w:proofErr w:type="spellEnd"/>
+      <w:r>
+        <w:t xml:space="preserve">(&gt;70) 양쪽 감점 (기존엔 </w:t>
+      </w:r>
+      <w:proofErr w:type="spellStart"/>
+      <w:r>
+        <w:t>과</w:t>
+      </w:r>
+      <w:r>
+        <w:lastRenderedPageBreak/>
+        <w:t>매도에</w:t>
+      </w:r>
+      <w:proofErr w:type="spellEnd"/>
+      <w:r>
+        <w:t xml:space="preserve"> 오히려 가점 주던 오류 수정)</w:t>
+      </w:r>
+    </w:p>
+    <w:p>
+      <w:r>
+        <w:t xml:space="preserve">**2) </w:t>
+      </w:r>
+      <w:proofErr w:type="spellStart"/>
+      <w:r>
+        <w:t>손절</w:t>
+      </w:r>
+      <w:proofErr w:type="spellEnd"/>
+      <w:r>
+        <w:t xml:space="preserve">/목표가 고정 + Day-by-Day 평가** — </w:t>
+      </w:r>
+      <w:proofErr w:type="spellStart"/>
+      <w:r>
+        <w:t>손절</w:t>
+      </w:r>
+      <w:proofErr w:type="spellEnd"/>
+      <w:r>
+        <w:t xml:space="preserve"> -5% / 목표 +10%, 7거래일 경로를 하루씩 순회하며 먼저 도달하는 쪽으로 판정 (기존엔 7일째 종가만 보고 판정해 중간 </w:t>
+      </w:r>
+      <w:proofErr w:type="spellStart"/>
+      <w:r>
+        <w:t>손절</w:t>
+      </w:r>
+      <w:proofErr w:type="spellEnd"/>
+      <w:r>
+        <w:t xml:space="preserve"> 케이스를 오판)</w:t>
+      </w:r>
+    </w:p>
+    <w:p>
+      <w:r>
+        <w:t>**3) 거래량 지속성 체크** — 연속 거래량 증가 일수(최대 3일)를 `</w:t>
+      </w:r>
+      <w:proofErr w:type="spellStart"/>
+      <w:r>
+        <w:t>volume_persistence_days</w:t>
+      </w:r>
+      <w:proofErr w:type="spellEnd"/>
+      <w:r>
+        <w:t>`로 신규 계산</w:t>
+      </w:r>
+    </w:p>
+    <w:p>
+      <w:r>
+        <w:t>**4) 모멘텀 스코어 가중치 재설계**</w:t>
+      </w:r>
+    </w:p>
+    <w:p/>
+    <w:p>
+      <w:r>
+        <w:t>| 항목 | 기존 | 변경 |</w:t>
+      </w:r>
+    </w:p>
+    <w:p>
+      <w:r>
+        <w:t>|---|---|---|</w:t>
+      </w:r>
+    </w:p>
+    <w:p>
+      <w:r>
+        <w:t>| 거래대금 폭발도 | 25% | 15% |</w:t>
+      </w:r>
+    </w:p>
+    <w:p>
+      <w:r>
+        <w:t>| 거래량 지속성 (신규) | - | 15% |</w:t>
+      </w:r>
+    </w:p>
+    <w:p>
+      <w:r>
+        <w:t>| 수급 점수 | 30% | 30% |</w:t>
+      </w:r>
+    </w:p>
+    <w:p>
+      <w:r>
+        <w:t>| 재료 유형 적합도 (신규) | - | 15% (수주=9, 정책=6, 실적=4, 테마=3) |</w:t>
+      </w:r>
+    </w:p>
+    <w:p>
+      <w:r>
+        <w:t>| 재료 감성 점수 | 20% | 5% |</w:t>
+      </w:r>
+    </w:p>
+    <w:p>
+      <w:r>
+        <w:t>| 기술적 위치(RSI) | 15% | 15% |</w:t>
+      </w:r>
+      <w:bookmarkStart w:id="0" w:name="_GoBack"/>
+      <w:bookmarkEnd w:id="0"/>
+    </w:p>
+    <w:p>
+      <w:r>
+        <w:t>| 테마 지속성 | 10% | 5% |</w:t>
+      </w:r>
+    </w:p>
+    <w:p>
+      <w:r>
+        <w:t>**5) 섹터 트렌드 리포트 (별도 트랙)** — 신규 `sector_trend.py`, `--mode trend` 추가</w:t>
+      </w:r>
+    </w:p>
+    <w:p/>
+    <w:p>
+      <w:r>
+        <w:t>**후속 조정**</w:t>
+      </w:r>
+    </w:p>
+    <w:p>
+      <w:r>
+        <w:t>- 스캔 풀 확대: KOSPI 5→10페이지, KOSDAQ 5→6페이지 (중소형주 누락 완화)</w:t>
+      </w:r>
+    </w:p>
+    <w:p>
+      <w:r>
+        <w:t>- 세부 분석 대상 확대: `candidates[</w:t>
+      </w:r>
+      <w:proofErr w:type="gramStart"/>
+      <w:r>
+        <w:t>:60</w:t>
+      </w:r>
+      <w:proofErr w:type="gramEnd"/>
+      <w:r>
+        <w:t>]` → `candidates[:100]`</w:t>
+      </w:r>
+    </w:p>
+    <w:p>
+      <w:r>
+        <w:t xml:space="preserve">- 상위 거래대금 </w:t>
+      </w:r>
+      <w:proofErr w:type="spellStart"/>
+      <w:r>
+        <w:t>임계값</w:t>
+      </w:r>
+      <w:proofErr w:type="spellEnd"/>
+      <w:r>
+        <w:t xml:space="preserve"> 완화: 상위 20% → 상위 30%</w:t>
+      </w:r>
+    </w:p>
+    <w:p>
+      <w:r>
+        <w:t>- 최종 추천 종목 수 확대: `</w:t>
+      </w:r>
+      <w:proofErr w:type="spellStart"/>
+      <w:r>
+        <w:t>top_k</w:t>
+      </w:r>
+      <w:proofErr w:type="spellEnd"/>
+      <w:r>
+        <w:t>` 5 → 10 (후보 풀 자체는 그대로, 이미 STEP4 통과한 종목을 더 많이 보여주는 효과)</w:t>
+      </w:r>
+    </w:p>
+    <w:p/>
+    <w:p/>
+    <w:p/>
+    <w:p/>
+    <w:p/>
+    <w:p/>
+    <w:p>
+      <w:pPr>
+        <w:rPr>
+          <w:rFonts w:hint="eastAsia"/>
+        </w:rPr>
+      </w:pPr>
+    </w:p>
     <w:p/>
     <w:sectPr>
       <w:pgSz w:w="11906" w:h="16838"/>

</xml_diff>